<commit_message>
Trim resolved access questions from the handover document
Employment Hero payroll and HR, the Y drive, the bonus leave tracker and the
rate increase spreadsheet are all already accessible, and CommBiz has been
confirmed as not needing an eToken. Removes those four questions and states
what is known instead, leaving CommBiz itself as the one outstanding piece.

Forty questions remain, renumbered continuously.

Co-Authored-By: Claude Opus 5 <noreply@anthropic.com>
Claude-Session: https://claude.ai/code/session_01NGLPCmZEnLwWWew5jbH6qG
</commit_message>
<xml_diff>
--- a/manuals/Payroll Handover - Questions and Scenarios.docx
+++ b/manuals/Payroll Handover - Questions and Scenarios.docx
@@ -245,7 +245,7 @@
           <w:sz w:val="22"/>
           <w:szCs w:val="22"/>
         </w:rPr>
-        <w:t xml:space="preserve">Two of these were flagged as outstanding during the recordings themselves — in Part 6 she says "I still don't have a login for CommBiz", and in Part 5 "I don't have any credit card details, I need to share that with you at some point". Chase these first; access requests take time and you cannot process a payroll without them.</w:t>
+        <w:t xml:space="preserve">Most access is already in place — Employment Hero payroll and HR, the Y drive, the bonus leave tracker and the rate increase spreadsheet. CommBiz is the one piece still outstanding, and it has been confirmed that it does not need an eToken. Chase it early: access requests take time and you cannot pay anyone without it.</w:t>
       </w:r>
     </w:p>
     <w:tbl>
@@ -447,7 +447,7 @@
                 <w:sz w:val="20"/>
                 <w:szCs w:val="20"/>
               </w:rPr>
-              <w:t xml:space="preserve">Does CommBiz require an eToken? If so, do I have one, and who issues it?</w:t>
+              <w:t xml:space="preserve">Who requests CommBiz access, and how long does it take to come through?</w:t>
             </w:r>
           </w:p>
         </w:tc>
@@ -509,7 +509,7 @@
                 <w:sz w:val="20"/>
                 <w:szCs w:val="20"/>
               </w:rPr>
-              <w:t xml:space="preserve">Who requests CommBiz access, and how long does it take to come through?</w:t>
+              <w:t xml:space="preserve">What are the company credit card details used for during payroll, and how do I get access to them?</w:t>
             </w:r>
           </w:p>
         </w:tc>
@@ -549,254 +549,6 @@
                 <w:szCs w:val="20"/>
               </w:rPr>
               <w:t xml:space="preserve">4</w:t>
-            </w:r>
-          </w:p>
-        </w:tc>
-        <w:tc>
-          <w:tcPr>
-            <w:tcW w:type="dxa" w:w="4400"/>
-            <w:shd w:fill="FFFFFF" w:val="clear"/>
-            <w:tcMar>
-              <w:top w:type="dxa" w:w="110"/>
-              <w:left w:type="dxa" w:w="140"/>
-              <w:bottom w:type="dxa" w:w="110"/>
-              <w:right w:type="dxa" w:w="140"/>
-            </w:tcMar>
-          </w:tcPr>
-          <w:p>
-            <w:r>
-              <w:rPr>
-                <w:b w:val="false"/>
-                <w:bCs w:val="false"/>
-                <w:sz w:val="20"/>
-                <w:szCs w:val="20"/>
-              </w:rPr>
-              <w:t xml:space="preserve">What are the company credit card details used for during payroll, and how do I get access to them?</w:t>
-            </w:r>
-          </w:p>
-        </w:tc>
-        <w:tc>
-          <w:tcPr>
-            <w:tcW w:type="dxa" w:w="4340"/>
-            <w:shd w:fill="FFFFFF" w:val="clear"/>
-            <w:tcMar>
-              <w:top w:type="dxa" w:w="110"/>
-              <w:left w:type="dxa" w:w="140"/>
-              <w:bottom w:type="dxa" w:w="110"/>
-              <w:right w:type="dxa" w:w="140"/>
-            </w:tcMar>
-          </w:tcPr>
-          <w:p/>
-          <w:p/>
-        </w:tc>
-      </w:tr>
-      <w:tr>
-        <w:tc>
-          <w:tcPr>
-            <w:tcW w:type="dxa" w:w="620"/>
-            <w:shd w:fill="F7F9FC" w:val="clear"/>
-            <w:tcMar>
-              <w:top w:type="dxa" w:w="110"/>
-              <w:left w:type="dxa" w:w="140"/>
-              <w:bottom w:type="dxa" w:w="110"/>
-              <w:right w:type="dxa" w:w="140"/>
-            </w:tcMar>
-          </w:tcPr>
-          <w:p>
-            <w:r>
-              <w:rPr>
-                <w:b/>
-                <w:bCs/>
-                <w:sz w:val="20"/>
-                <w:szCs w:val="20"/>
-              </w:rPr>
-              <w:t xml:space="preserve">5</w:t>
-            </w:r>
-          </w:p>
-        </w:tc>
-        <w:tc>
-          <w:tcPr>
-            <w:tcW w:type="dxa" w:w="4400"/>
-            <w:shd w:fill="F7F9FC" w:val="clear"/>
-            <w:tcMar>
-              <w:top w:type="dxa" w:w="110"/>
-              <w:left w:type="dxa" w:w="140"/>
-              <w:bottom w:type="dxa" w:w="110"/>
-              <w:right w:type="dxa" w:w="140"/>
-            </w:tcMar>
-          </w:tcPr>
-          <w:p>
-            <w:r>
-              <w:rPr>
-                <w:b w:val="false"/>
-                <w:bCs w:val="false"/>
-                <w:sz w:val="20"/>
-                <w:szCs w:val="20"/>
-              </w:rPr>
-              <w:t xml:space="preserve">Employment Hero payroll and Employment Hero HR are separate systems with separate URLs. Do I have admin access to both?</w:t>
-            </w:r>
-          </w:p>
-        </w:tc>
-        <w:tc>
-          <w:tcPr>
-            <w:tcW w:type="dxa" w:w="4340"/>
-            <w:shd w:fill="F7F9FC" w:val="clear"/>
-            <w:tcMar>
-              <w:top w:type="dxa" w:w="110"/>
-              <w:left w:type="dxa" w:w="140"/>
-              <w:bottom w:type="dxa" w:w="110"/>
-              <w:right w:type="dxa" w:w="140"/>
-            </w:tcMar>
-          </w:tcPr>
-          <w:p/>
-          <w:p/>
-        </w:tc>
-      </w:tr>
-      <w:tr>
-        <w:tc>
-          <w:tcPr>
-            <w:tcW w:type="dxa" w:w="620"/>
-            <w:shd w:fill="FFFFFF" w:val="clear"/>
-            <w:tcMar>
-              <w:top w:type="dxa" w:w="110"/>
-              <w:left w:type="dxa" w:w="140"/>
-              <w:bottom w:type="dxa" w:w="110"/>
-              <w:right w:type="dxa" w:w="140"/>
-            </w:tcMar>
-          </w:tcPr>
-          <w:p>
-            <w:r>
-              <w:rPr>
-                <w:b/>
-                <w:bCs/>
-                <w:sz w:val="20"/>
-                <w:szCs w:val="20"/>
-              </w:rPr>
-              <w:t xml:space="preserve">6</w:t>
-            </w:r>
-          </w:p>
-        </w:tc>
-        <w:tc>
-          <w:tcPr>
-            <w:tcW w:type="dxa" w:w="4400"/>
-            <w:shd w:fill="FFFFFF" w:val="clear"/>
-            <w:tcMar>
-              <w:top w:type="dxa" w:w="110"/>
-              <w:left w:type="dxa" w:w="140"/>
-              <w:bottom w:type="dxa" w:w="110"/>
-              <w:right w:type="dxa" w:w="140"/>
-            </w:tcMar>
-          </w:tcPr>
-          <w:p>
-            <w:r>
-              <w:rPr>
-                <w:b w:val="false"/>
-                <w:bCs w:val="false"/>
-                <w:sz w:val="20"/>
-                <w:szCs w:val="20"/>
-              </w:rPr>
-              <w:t xml:space="preserve">Do I have write access to the Y drive at 03 Payroll and everything beneath it?</w:t>
-            </w:r>
-          </w:p>
-        </w:tc>
-        <w:tc>
-          <w:tcPr>
-            <w:tcW w:type="dxa" w:w="4340"/>
-            <w:shd w:fill="FFFFFF" w:val="clear"/>
-            <w:tcMar>
-              <w:top w:type="dxa" w:w="110"/>
-              <w:left w:type="dxa" w:w="140"/>
-              <w:bottom w:type="dxa" w:w="110"/>
-              <w:right w:type="dxa" w:w="140"/>
-            </w:tcMar>
-          </w:tcPr>
-          <w:p/>
-          <w:p/>
-        </w:tc>
-      </w:tr>
-      <w:tr>
-        <w:tc>
-          <w:tcPr>
-            <w:tcW w:type="dxa" w:w="620"/>
-            <w:shd w:fill="F7F9FC" w:val="clear"/>
-            <w:tcMar>
-              <w:top w:type="dxa" w:w="110"/>
-              <w:left w:type="dxa" w:w="140"/>
-              <w:bottom w:type="dxa" w:w="110"/>
-              <w:right w:type="dxa" w:w="140"/>
-            </w:tcMar>
-          </w:tcPr>
-          <w:p>
-            <w:r>
-              <w:rPr>
-                <w:b/>
-                <w:bCs/>
-                <w:sz w:val="20"/>
-                <w:szCs w:val="20"/>
-              </w:rPr>
-              <w:t xml:space="preserve">7</w:t>
-            </w:r>
-          </w:p>
-        </w:tc>
-        <w:tc>
-          <w:tcPr>
-            <w:tcW w:type="dxa" w:w="4400"/>
-            <w:shd w:fill="F7F9FC" w:val="clear"/>
-            <w:tcMar>
-              <w:top w:type="dxa" w:w="110"/>
-              <w:left w:type="dxa" w:w="140"/>
-              <w:bottom w:type="dxa" w:w="110"/>
-              <w:right w:type="dxa" w:w="140"/>
-            </w:tcMar>
-          </w:tcPr>
-          <w:p>
-            <w:r>
-              <w:rPr>
-                <w:b w:val="false"/>
-                <w:bCs w:val="false"/>
-                <w:sz w:val="20"/>
-                <w:szCs w:val="20"/>
-              </w:rPr>
-              <w:t xml:space="preserve">Where do the bonus leave tracker and the rate increase spreadsheet live, and do I have access to both?</w:t>
-            </w:r>
-          </w:p>
-        </w:tc>
-        <w:tc>
-          <w:tcPr>
-            <w:tcW w:type="dxa" w:w="4340"/>
-            <w:shd w:fill="F7F9FC" w:val="clear"/>
-            <w:tcMar>
-              <w:top w:type="dxa" w:w="110"/>
-              <w:left w:type="dxa" w:w="140"/>
-              <w:bottom w:type="dxa" w:w="110"/>
-              <w:right w:type="dxa" w:w="140"/>
-            </w:tcMar>
-          </w:tcPr>
-          <w:p/>
-          <w:p/>
-        </w:tc>
-      </w:tr>
-      <w:tr>
-        <w:tc>
-          <w:tcPr>
-            <w:tcW w:type="dxa" w:w="620"/>
-            <w:shd w:fill="FFFFFF" w:val="clear"/>
-            <w:tcMar>
-              <w:top w:type="dxa" w:w="110"/>
-              <w:left w:type="dxa" w:w="140"/>
-              <w:bottom w:type="dxa" w:w="110"/>
-              <w:right w:type="dxa" w:w="140"/>
-            </w:tcMar>
-          </w:tcPr>
-          <w:p>
-            <w:r>
-              <w:rPr>
-                <w:b/>
-                <w:bCs/>
-                <w:sz w:val="20"/>
-                <w:szCs w:val="20"/>
-              </w:rPr>
-              <w:t xml:space="preserve">8</w:t>
             </w:r>
           </w:p>
         </w:tc>
@@ -986,7 +738,7 @@
                 <w:sz w:val="20"/>
                 <w:szCs w:val="20"/>
               </w:rPr>
-              <w:t xml:space="preserve">9</w:t>
+              <w:t xml:space="preserve">5</w:t>
             </w:r>
           </w:p>
         </w:tc>
@@ -1048,7 +800,7 @@
                 <w:sz w:val="20"/>
                 <w:szCs w:val="20"/>
               </w:rPr>
-              <w:t xml:space="preserve">10</w:t>
+              <w:t xml:space="preserve">6</w:t>
             </w:r>
           </w:p>
         </w:tc>
@@ -1110,7 +862,7 @@
                 <w:sz w:val="20"/>
                 <w:szCs w:val="20"/>
               </w:rPr>
-              <w:t xml:space="preserve">11</w:t>
+              <w:t xml:space="preserve">7</w:t>
             </w:r>
           </w:p>
         </w:tc>
@@ -1172,7 +924,7 @@
                 <w:sz w:val="20"/>
                 <w:szCs w:val="20"/>
               </w:rPr>
-              <w:t xml:space="preserve">12</w:t>
+              <w:t xml:space="preserve">8</w:t>
             </w:r>
           </w:p>
         </w:tc>
@@ -1234,7 +986,7 @@
                 <w:sz w:val="20"/>
                 <w:szCs w:val="20"/>
               </w:rPr>
-              <w:t xml:space="preserve">13</w:t>
+              <w:t xml:space="preserve">9</w:t>
             </w:r>
           </w:p>
         </w:tc>
@@ -1296,7 +1048,7 @@
                 <w:sz w:val="20"/>
                 <w:szCs w:val="20"/>
               </w:rPr>
-              <w:t xml:space="preserve">14</w:t>
+              <w:t xml:space="preserve">10</w:t>
             </w:r>
           </w:p>
         </w:tc>
@@ -1486,7 +1238,7 @@
                 <w:sz w:val="20"/>
                 <w:szCs w:val="20"/>
               </w:rPr>
-              <w:t xml:space="preserve">15</w:t>
+              <w:t xml:space="preserve">11</w:t>
             </w:r>
           </w:p>
         </w:tc>
@@ -1548,7 +1300,7 @@
                 <w:sz w:val="20"/>
                 <w:szCs w:val="20"/>
               </w:rPr>
-              <w:t xml:space="preserve">16</w:t>
+              <w:t xml:space="preserve">12</w:t>
             </w:r>
           </w:p>
         </w:tc>
@@ -1610,7 +1362,7 @@
                 <w:sz w:val="20"/>
                 <w:szCs w:val="20"/>
               </w:rPr>
-              <w:t xml:space="preserve">17</w:t>
+              <w:t xml:space="preserve">13</w:t>
             </w:r>
           </w:p>
         </w:tc>
@@ -1672,7 +1424,7 @@
                 <w:sz w:val="20"/>
                 <w:szCs w:val="20"/>
               </w:rPr>
-              <w:t xml:space="preserve">18</w:t>
+              <w:t xml:space="preserve">14</w:t>
             </w:r>
           </w:p>
         </w:tc>
@@ -1734,7 +1486,7 @@
                 <w:sz w:val="20"/>
                 <w:szCs w:val="20"/>
               </w:rPr>
-              <w:t xml:space="preserve">19</w:t>
+              <w:t xml:space="preserve">15</w:t>
             </w:r>
           </w:p>
         </w:tc>
@@ -1796,7 +1548,7 @@
                 <w:sz w:val="20"/>
                 <w:szCs w:val="20"/>
               </w:rPr>
-              <w:t xml:space="preserve">20</w:t>
+              <w:t xml:space="preserve">16</w:t>
             </w:r>
           </w:p>
         </w:tc>
@@ -1858,7 +1610,7 @@
                 <w:sz w:val="20"/>
                 <w:szCs w:val="20"/>
               </w:rPr>
-              <w:t xml:space="preserve">21</w:t>
+              <w:t xml:space="preserve">17</w:t>
             </w:r>
           </w:p>
         </w:tc>
@@ -2064,7 +1816,7 @@
                 <w:sz w:val="20"/>
                 <w:szCs w:val="20"/>
               </w:rPr>
-              <w:t xml:space="preserve">22</w:t>
+              <w:t xml:space="preserve">18</w:t>
             </w:r>
           </w:p>
         </w:tc>
@@ -2126,7 +1878,7 @@
                 <w:sz w:val="20"/>
                 <w:szCs w:val="20"/>
               </w:rPr>
-              <w:t xml:space="preserve">23</w:t>
+              <w:t xml:space="preserve">19</w:t>
             </w:r>
           </w:p>
         </w:tc>
@@ -2188,7 +1940,7 @@
                 <w:sz w:val="20"/>
                 <w:szCs w:val="20"/>
               </w:rPr>
-              <w:t xml:space="preserve">24</w:t>
+              <w:t xml:space="preserve">20</w:t>
             </w:r>
           </w:p>
         </w:tc>
@@ -2250,7 +2002,7 @@
                 <w:sz w:val="20"/>
                 <w:szCs w:val="20"/>
               </w:rPr>
-              <w:t xml:space="preserve">25</w:t>
+              <w:t xml:space="preserve">21</w:t>
             </w:r>
           </w:p>
         </w:tc>
@@ -2312,7 +2064,7 @@
                 <w:sz w:val="20"/>
                 <w:szCs w:val="20"/>
               </w:rPr>
-              <w:t xml:space="preserve">26</w:t>
+              <w:t xml:space="preserve">22</w:t>
             </w:r>
           </w:p>
         </w:tc>
@@ -2374,7 +2126,7 @@
                 <w:sz w:val="20"/>
                 <w:szCs w:val="20"/>
               </w:rPr>
-              <w:t xml:space="preserve">27</w:t>
+              <w:t xml:space="preserve">23</w:t>
             </w:r>
           </w:p>
         </w:tc>
@@ -2436,7 +2188,7 @@
                 <w:sz w:val="20"/>
                 <w:szCs w:val="20"/>
               </w:rPr>
-              <w:t xml:space="preserve">28</w:t>
+              <w:t xml:space="preserve">24</w:t>
             </w:r>
           </w:p>
         </w:tc>
@@ -2614,7 +2366,7 @@
                 <w:sz w:val="20"/>
                 <w:szCs w:val="20"/>
               </w:rPr>
-              <w:t xml:space="preserve">29</w:t>
+              <w:t xml:space="preserve">25</w:t>
             </w:r>
           </w:p>
         </w:tc>
@@ -2676,7 +2428,7 @@
                 <w:sz w:val="20"/>
                 <w:szCs w:val="20"/>
               </w:rPr>
-              <w:t xml:space="preserve">30</w:t>
+              <w:t xml:space="preserve">26</w:t>
             </w:r>
           </w:p>
         </w:tc>
@@ -2738,7 +2490,7 @@
                 <w:sz w:val="20"/>
                 <w:szCs w:val="20"/>
               </w:rPr>
-              <w:t xml:space="preserve">31</w:t>
+              <w:t xml:space="preserve">27</w:t>
             </w:r>
           </w:p>
         </w:tc>
@@ -2800,7 +2552,7 @@
                 <w:sz w:val="20"/>
                 <w:szCs w:val="20"/>
               </w:rPr>
-              <w:t xml:space="preserve">32</w:t>
+              <w:t xml:space="preserve">28</w:t>
             </w:r>
           </w:p>
         </w:tc>
@@ -2862,7 +2614,7 @@
                 <w:sz w:val="20"/>
                 <w:szCs w:val="20"/>
               </w:rPr>
-              <w:t xml:space="preserve">33</w:t>
+              <w:t xml:space="preserve">29</w:t>
             </w:r>
           </w:p>
         </w:tc>
@@ -2924,7 +2676,7 @@
                 <w:sz w:val="20"/>
                 <w:szCs w:val="20"/>
               </w:rPr>
-              <w:t xml:space="preserve">34</w:t>
+              <w:t xml:space="preserve">30</w:t>
             </w:r>
           </w:p>
         </w:tc>
@@ -2986,7 +2738,7 @@
                 <w:sz w:val="20"/>
                 <w:szCs w:val="20"/>
               </w:rPr>
-              <w:t xml:space="preserve">35</w:t>
+              <w:t xml:space="preserve">31</w:t>
             </w:r>
           </w:p>
         </w:tc>
@@ -3164,7 +2916,7 @@
                 <w:sz w:val="20"/>
                 <w:szCs w:val="20"/>
               </w:rPr>
-              <w:t xml:space="preserve">36</w:t>
+              <w:t xml:space="preserve">32</w:t>
             </w:r>
           </w:p>
         </w:tc>
@@ -3226,7 +2978,7 @@
                 <w:sz w:val="20"/>
                 <w:szCs w:val="20"/>
               </w:rPr>
-              <w:t xml:space="preserve">37</w:t>
+              <w:t xml:space="preserve">33</w:t>
             </w:r>
           </w:p>
         </w:tc>
@@ -3288,7 +3040,7 @@
                 <w:sz w:val="20"/>
                 <w:szCs w:val="20"/>
               </w:rPr>
-              <w:t xml:space="preserve">38</w:t>
+              <w:t xml:space="preserve">34</w:t>
             </w:r>
           </w:p>
         </w:tc>
@@ -3350,7 +3102,7 @@
                 <w:sz w:val="20"/>
                 <w:szCs w:val="20"/>
               </w:rPr>
-              <w:t xml:space="preserve">39</w:t>
+              <w:t xml:space="preserve">35</w:t>
             </w:r>
           </w:p>
         </w:tc>
@@ -3528,7 +3280,7 @@
                 <w:sz w:val="20"/>
                 <w:szCs w:val="20"/>
               </w:rPr>
-              <w:t xml:space="preserve">40</w:t>
+              <w:t xml:space="preserve">36</w:t>
             </w:r>
           </w:p>
         </w:tc>
@@ -3590,7 +3342,7 @@
                 <w:sz w:val="20"/>
                 <w:szCs w:val="20"/>
               </w:rPr>
-              <w:t xml:space="preserve">41</w:t>
+              <w:t xml:space="preserve">37</w:t>
             </w:r>
           </w:p>
         </w:tc>
@@ -3652,7 +3404,7 @@
                 <w:sz w:val="20"/>
                 <w:szCs w:val="20"/>
               </w:rPr>
-              <w:t xml:space="preserve">42</w:t>
+              <w:t xml:space="preserve">38</w:t>
             </w:r>
           </w:p>
         </w:tc>
@@ -3714,7 +3466,7 @@
                 <w:sz w:val="20"/>
                 <w:szCs w:val="20"/>
               </w:rPr>
-              <w:t xml:space="preserve">43</w:t>
+              <w:t xml:space="preserve">39</w:t>
             </w:r>
           </w:p>
         </w:tc>
@@ -3776,7 +3528,7 @@
                 <w:sz w:val="20"/>
                 <w:szCs w:val="20"/>
               </w:rPr>
-              <w:t xml:space="preserve">44</w:t>
+              <w:t xml:space="preserve">40</w:t>
             </w:r>
           </w:p>
         </w:tc>

</xml_diff>

<commit_message>
Record answered handover questions and drop the ones not needed
Parental leave and the timesheet cut-off are now answered rather than open,
so they become stated facts in the document instead of questions. Parental
leave is unpaid with no policy, taken as annual leave or leave without pay,
which points the reader at Part 3c and its rounding-rule trap. The cut-off
is 10am on the Monday of the processing week.

Also drops two questions that are not needed and narrows the insufficient
funds scenario, since savings has always covered the transfer and the real
question there is how much notice it needs to clear.

Co-Authored-By: Claude Opus 5 <noreply@anthropic.com>
Claude-Session: https://claude.ai/code/session_01NGLPCmZEnLwWWew5jbH6qG
</commit_message>
<xml_diff>
--- a/manuals/Payroll Handover - Questions and Scenarios.docx
+++ b/manuals/Payroll Handover - Questions and Scenarios.docx
@@ -1128,528 +1128,48 @@
       <w:tblPr>
         <w:tblW w:type="auto" w:w="100"/>
         <w:tblBorders>
-          <w:top w:val="single" w:color="auto" w:sz="4"/>
-          <w:left w:val="single" w:color="auto" w:sz="4"/>
-          <w:bottom w:val="single" w:color="auto" w:sz="4"/>
-          <w:right w:val="single" w:color="auto" w:sz="4"/>
-          <w:insideH w:val="single" w:color="auto" w:sz="4"/>
-          <w:insideV w:val="single" w:color="auto" w:sz="4"/>
+          <w:top w:val="single" w:color="D0D7E5" w:sz="2"/>
+          <w:left w:val="single" w:color="1F4E79" w:sz="18"/>
+          <w:bottom w:val="single" w:color="D0D7E5" w:sz="2"/>
+          <w:right w:val="single" w:color="D0D7E5" w:sz="2"/>
+          <w:insideH w:val="none"/>
+          <w:insideV w:val="none"/>
         </w:tblBorders>
       </w:tblPr>
       <w:tblGrid>
-        <w:gridCol w:w="620"/>
-        <w:gridCol w:w="4400"/>
-        <w:gridCol w:w="4340"/>
+        <w:gridCol w:w="9360"/>
       </w:tblGrid>
       <w:tr>
-        <w:trPr>
-          <w:tblHeader/>
-        </w:trPr>
-        <w:tc>
-          <w:tcPr>
-            <w:tcW w:type="dxa" w:w="620"/>
-            <w:shd w:fill="1F4E79" w:val="clear"/>
-            <w:tcMar>
-              <w:top w:type="dxa" w:w="110"/>
-              <w:left w:type="dxa" w:w="140"/>
-              <w:bottom w:type="dxa" w:w="110"/>
-              <w:right w:type="dxa" w:w="140"/>
-            </w:tcMar>
-          </w:tcPr>
-          <w:p>
-            <w:r>
-              <w:rPr>
-                <w:b/>
-                <w:bCs/>
-                <w:color w:val="FFFFFF"/>
-                <w:sz w:val="20"/>
-                <w:szCs w:val="20"/>
-              </w:rPr>
-              <w:t xml:space="preserve">#</w:t>
-            </w:r>
-          </w:p>
-        </w:tc>
-        <w:tc>
-          <w:tcPr>
-            <w:tcW w:type="dxa" w:w="4400"/>
-            <w:shd w:fill="1F4E79" w:val="clear"/>
-            <w:tcMar>
-              <w:top w:type="dxa" w:w="110"/>
-              <w:left w:type="dxa" w:w="140"/>
-              <w:bottom w:type="dxa" w:w="110"/>
-              <w:right w:type="dxa" w:w="140"/>
-            </w:tcMar>
-          </w:tcPr>
-          <w:p>
-            <w:r>
-              <w:rPr>
-                <w:b/>
-                <w:bCs/>
-                <w:color w:val="FFFFFF"/>
-                <w:sz w:val="20"/>
-                <w:szCs w:val="20"/>
-              </w:rPr>
-              <w:t xml:space="preserve">Question</w:t>
-            </w:r>
-          </w:p>
-        </w:tc>
-        <w:tc>
-          <w:tcPr>
-            <w:tcW w:type="dxa" w:w="4340"/>
-            <w:shd w:fill="1F4E79" w:val="clear"/>
-            <w:tcMar>
-              <w:top w:type="dxa" w:w="110"/>
-              <w:left w:type="dxa" w:w="140"/>
-              <w:bottom w:type="dxa" w:w="110"/>
-              <w:right w:type="dxa" w:w="140"/>
-            </w:tcMar>
-          </w:tcPr>
-          <w:p>
-            <w:r>
-              <w:rPr>
-                <w:b/>
-                <w:bCs/>
-                <w:color w:val="FFFFFF"/>
-                <w:sz w:val="20"/>
-                <w:szCs w:val="20"/>
-              </w:rPr>
-              <w:t xml:space="preserve">Answer</w:t>
-            </w:r>
-          </w:p>
-        </w:tc>
-      </w:tr>
-      <w:tr>
-        <w:tc>
-          <w:tcPr>
-            <w:tcW w:type="dxa" w:w="620"/>
-            <w:shd w:fill="F7F9FC" w:val="clear"/>
-            <w:tcMar>
-              <w:top w:type="dxa" w:w="110"/>
-              <w:left w:type="dxa" w:w="140"/>
-              <w:bottom w:type="dxa" w:w="110"/>
-              <w:right w:type="dxa" w:w="140"/>
-            </w:tcMar>
-          </w:tcPr>
-          <w:p>
-            <w:r>
-              <w:rPr>
-                <w:b/>
-                <w:bCs/>
-                <w:sz w:val="20"/>
-                <w:szCs w:val="20"/>
-              </w:rPr>
-              <w:t xml:space="preserve">11</w:t>
-            </w:r>
-          </w:p>
-        </w:tc>
-        <w:tc>
-          <w:tcPr>
-            <w:tcW w:type="dxa" w:w="4400"/>
-            <w:shd w:fill="F7F9FC" w:val="clear"/>
-            <w:tcMar>
-              <w:top w:type="dxa" w:w="110"/>
-              <w:left w:type="dxa" w:w="140"/>
-              <w:bottom w:type="dxa" w:w="110"/>
-              <w:right w:type="dxa" w:w="140"/>
-            </w:tcMar>
-          </w:tcPr>
-          <w:p>
-            <w:r>
-              <w:rPr>
-                <w:b w:val="false"/>
-                <w:bCs w:val="false"/>
-                <w:sz w:val="20"/>
-                <w:szCs w:val="20"/>
-              </w:rPr>
-              <w:t xml:space="preserve">How is a termination handled? Final pay, unused annual leave payout, time in lieu balance, and what changes on the last pay run.</w:t>
-            </w:r>
-          </w:p>
-        </w:tc>
-        <w:tc>
-          <w:tcPr>
-            <w:tcW w:type="dxa" w:w="4340"/>
-            <w:shd w:fill="F7F9FC" w:val="clear"/>
-            <w:tcMar>
-              <w:top w:type="dxa" w:w="110"/>
-              <w:left w:type="dxa" w:w="140"/>
-              <w:bottom w:type="dxa" w:w="110"/>
-              <w:right w:type="dxa" w:w="140"/>
-            </w:tcMar>
-          </w:tcPr>
-          <w:p/>
-          <w:p/>
-        </w:tc>
-      </w:tr>
-      <w:tr>
-        <w:tc>
-          <w:tcPr>
-            <w:tcW w:type="dxa" w:w="620"/>
-            <w:shd w:fill="FFFFFF" w:val="clear"/>
-            <w:tcMar>
-              <w:top w:type="dxa" w:w="110"/>
-              <w:left w:type="dxa" w:w="140"/>
-              <w:bottom w:type="dxa" w:w="110"/>
-              <w:right w:type="dxa" w:w="140"/>
-            </w:tcMar>
-          </w:tcPr>
-          <w:p>
-            <w:r>
-              <w:rPr>
-                <w:b/>
-                <w:bCs/>
-                <w:sz w:val="20"/>
-                <w:szCs w:val="20"/>
-              </w:rPr>
-              <w:t xml:space="preserve">12</w:t>
-            </w:r>
-          </w:p>
-        </w:tc>
-        <w:tc>
-          <w:tcPr>
-            <w:tcW w:type="dxa" w:w="4400"/>
-            <w:shd w:fill="FFFFFF" w:val="clear"/>
-            <w:tcMar>
-              <w:top w:type="dxa" w:w="110"/>
-              <w:left w:type="dxa" w:w="140"/>
-              <w:bottom w:type="dxa" w:w="110"/>
-              <w:right w:type="dxa" w:w="140"/>
-            </w:tcMar>
-          </w:tcPr>
-          <w:p>
-            <w:r>
-              <w:rPr>
-                <w:b w:val="false"/>
-                <w:bCs w:val="false"/>
-                <w:sz w:val="20"/>
-                <w:szCs w:val="20"/>
-              </w:rPr>
-              <w:t xml:space="preserve">The Create Pay Run screen has an 'Include terminated employees' checkbox that we always leave unticked. When would it need ticking?</w:t>
-            </w:r>
-          </w:p>
-        </w:tc>
-        <w:tc>
-          <w:tcPr>
-            <w:tcW w:type="dxa" w:w="4340"/>
-            <w:shd w:fill="FFFFFF" w:val="clear"/>
-            <w:tcMar>
-              <w:top w:type="dxa" w:w="110"/>
-              <w:left w:type="dxa" w:w="140"/>
-              <w:bottom w:type="dxa" w:w="110"/>
-              <w:right w:type="dxa" w:w="140"/>
-            </w:tcMar>
-          </w:tcPr>
-          <w:p/>
-          <w:p/>
-        </w:tc>
-      </w:tr>
-      <w:tr>
-        <w:tc>
-          <w:tcPr>
-            <w:tcW w:type="dxa" w:w="620"/>
-            <w:shd w:fill="F7F9FC" w:val="clear"/>
-            <w:tcMar>
-              <w:top w:type="dxa" w:w="110"/>
-              <w:left w:type="dxa" w:w="140"/>
-              <w:bottom w:type="dxa" w:w="110"/>
-              <w:right w:type="dxa" w:w="140"/>
-            </w:tcMar>
-          </w:tcPr>
-          <w:p>
-            <w:r>
-              <w:rPr>
-                <w:b/>
-                <w:bCs/>
-                <w:sz w:val="20"/>
-                <w:szCs w:val="20"/>
-              </w:rPr>
-              <w:t xml:space="preserve">13</w:t>
-            </w:r>
-          </w:p>
-        </w:tc>
-        <w:tc>
-          <w:tcPr>
-            <w:tcW w:type="dxa" w:w="4400"/>
-            <w:shd w:fill="F7F9FC" w:val="clear"/>
-            <w:tcMar>
-              <w:top w:type="dxa" w:w="110"/>
-              <w:left w:type="dxa" w:w="140"/>
-              <w:bottom w:type="dxa" w:w="110"/>
-              <w:right w:type="dxa" w:w="140"/>
-            </w:tcMar>
-          </w:tcPr>
-          <w:p>
-            <w:r>
-              <w:rPr>
-                <w:b w:val="false"/>
-                <w:bCs w:val="false"/>
-                <w:sz w:val="20"/>
-                <w:szCs w:val="20"/>
-              </w:rPr>
-              <w:t xml:space="preserve">How is parental leave handled in a pay run — paid, unpaid, government-funded, and what changes fortnight to fortnight?</w:t>
-            </w:r>
-          </w:p>
-        </w:tc>
-        <w:tc>
-          <w:tcPr>
-            <w:tcW w:type="dxa" w:w="4340"/>
-            <w:shd w:fill="F7F9FC" w:val="clear"/>
-            <w:tcMar>
-              <w:top w:type="dxa" w:w="110"/>
-              <w:left w:type="dxa" w:w="140"/>
-              <w:bottom w:type="dxa" w:w="110"/>
-              <w:right w:type="dxa" w:w="140"/>
-            </w:tcMar>
-          </w:tcPr>
-          <w:p/>
-          <w:p/>
-        </w:tc>
-      </w:tr>
-      <w:tr>
-        <w:tc>
-          <w:tcPr>
-            <w:tcW w:type="dxa" w:w="620"/>
-            <w:shd w:fill="FFFFFF" w:val="clear"/>
-            <w:tcMar>
-              <w:top w:type="dxa" w:w="110"/>
-              <w:left w:type="dxa" w:w="140"/>
-              <w:bottom w:type="dxa" w:w="110"/>
-              <w:right w:type="dxa" w:w="140"/>
-            </w:tcMar>
-          </w:tcPr>
-          <w:p>
-            <w:r>
-              <w:rPr>
-                <w:b/>
-                <w:bCs/>
-                <w:sz w:val="20"/>
-                <w:szCs w:val="20"/>
-              </w:rPr>
-              <w:t xml:space="preserve">14</w:t>
-            </w:r>
-          </w:p>
-        </w:tc>
-        <w:tc>
-          <w:tcPr>
-            <w:tcW w:type="dxa" w:w="4400"/>
-            <w:shd w:fill="FFFFFF" w:val="clear"/>
-            <w:tcMar>
-              <w:top w:type="dxa" w:w="110"/>
-              <w:left w:type="dxa" w:w="140"/>
-              <w:bottom w:type="dxa" w:w="110"/>
-              <w:right w:type="dxa" w:w="140"/>
-            </w:tcMar>
-          </w:tcPr>
-          <w:p>
-            <w:r>
-              <w:rPr>
-                <w:b w:val="false"/>
-                <w:bCs w:val="false"/>
-                <w:sz w:val="20"/>
-                <w:szCs w:val="20"/>
-              </w:rPr>
-              <w:t xml:space="preserve">What does payroll need to do for a new starter's first pay — TFN declaration, super choice, anything that must be in place before they can be paid?</w:t>
-            </w:r>
-          </w:p>
-        </w:tc>
-        <w:tc>
-          <w:tcPr>
-            <w:tcW w:type="dxa" w:w="4340"/>
-            <w:shd w:fill="FFFFFF" w:val="clear"/>
-            <w:tcMar>
-              <w:top w:type="dxa" w:w="110"/>
-              <w:left w:type="dxa" w:w="140"/>
-              <w:bottom w:type="dxa" w:w="110"/>
-              <w:right w:type="dxa" w:w="140"/>
-            </w:tcMar>
-          </w:tcPr>
-          <w:p/>
-          <w:p/>
-        </w:tc>
-      </w:tr>
-      <w:tr>
-        <w:tc>
-          <w:tcPr>
-            <w:tcW w:type="dxa" w:w="620"/>
-            <w:shd w:fill="F7F9FC" w:val="clear"/>
-            <w:tcMar>
-              <w:top w:type="dxa" w:w="110"/>
-              <w:left w:type="dxa" w:w="140"/>
-              <w:bottom w:type="dxa" w:w="110"/>
-              <w:right w:type="dxa" w:w="140"/>
-            </w:tcMar>
-          </w:tcPr>
-          <w:p>
-            <w:r>
-              <w:rPr>
-                <w:b/>
-                <w:bCs/>
-                <w:sz w:val="20"/>
-                <w:szCs w:val="20"/>
-              </w:rPr>
-              <w:t xml:space="preserve">15</w:t>
-            </w:r>
-          </w:p>
-        </w:tc>
-        <w:tc>
-          <w:tcPr>
-            <w:tcW w:type="dxa" w:w="4400"/>
-            <w:shd w:fill="F7F9FC" w:val="clear"/>
-            <w:tcMar>
-              <w:top w:type="dxa" w:w="110"/>
-              <w:left w:type="dxa" w:w="140"/>
-              <w:bottom w:type="dxa" w:w="110"/>
-              <w:right w:type="dxa" w:w="140"/>
-            </w:tcMar>
-          </w:tcPr>
-          <w:p>
-            <w:r>
-              <w:rPr>
-                <w:b w:val="false"/>
-                <w:bCs w:val="false"/>
-                <w:sz w:val="20"/>
-                <w:szCs w:val="20"/>
-              </w:rPr>
-              <w:t xml:space="preserve">What do I do if I find an error after the pay run is finalised and super has been paid?</w:t>
-            </w:r>
-          </w:p>
-        </w:tc>
-        <w:tc>
-          <w:tcPr>
-            <w:tcW w:type="dxa" w:w="4340"/>
-            <w:shd w:fill="F7F9FC" w:val="clear"/>
-            <w:tcMar>
-              <w:top w:type="dxa" w:w="110"/>
-              <w:left w:type="dxa" w:w="140"/>
-              <w:bottom w:type="dxa" w:w="110"/>
-              <w:right w:type="dxa" w:w="140"/>
-            </w:tcMar>
-          </w:tcPr>
-          <w:p/>
-          <w:p/>
-        </w:tc>
-      </w:tr>
-      <w:tr>
-        <w:tc>
-          <w:tcPr>
-            <w:tcW w:type="dxa" w:w="620"/>
-            <w:shd w:fill="FFFFFF" w:val="clear"/>
-            <w:tcMar>
-              <w:top w:type="dxa" w:w="110"/>
-              <w:left w:type="dxa" w:w="140"/>
-              <w:bottom w:type="dxa" w:w="110"/>
-              <w:right w:type="dxa" w:w="140"/>
-            </w:tcMar>
-          </w:tcPr>
-          <w:p>
-            <w:r>
-              <w:rPr>
-                <w:b/>
-                <w:bCs/>
-                <w:sz w:val="20"/>
-                <w:szCs w:val="20"/>
-              </w:rPr>
-              <w:t xml:space="preserve">16</w:t>
-            </w:r>
-          </w:p>
-        </w:tc>
-        <w:tc>
-          <w:tcPr>
-            <w:tcW w:type="dxa" w:w="4400"/>
-            <w:shd w:fill="FFFFFF" w:val="clear"/>
-            <w:tcMar>
-              <w:top w:type="dxa" w:w="110"/>
-              <w:left w:type="dxa" w:w="140"/>
-              <w:bottom w:type="dxa" w:w="110"/>
-              <w:right w:type="dxa" w:w="140"/>
-            </w:tcMar>
-          </w:tcPr>
-          <w:p>
-            <w:r>
-              <w:rPr>
-                <w:b w:val="false"/>
-                <w:bCs w:val="false"/>
-                <w:sz w:val="20"/>
-                <w:szCs w:val="20"/>
-              </w:rPr>
-              <w:t xml:space="preserve">What happens if an employee's bank details are wrong and the payment bounces back?</w:t>
-            </w:r>
-          </w:p>
-        </w:tc>
-        <w:tc>
-          <w:tcPr>
-            <w:tcW w:type="dxa" w:w="4340"/>
-            <w:shd w:fill="FFFFFF" w:val="clear"/>
-            <w:tcMar>
-              <w:top w:type="dxa" w:w="110"/>
-              <w:left w:type="dxa" w:w="140"/>
-              <w:bottom w:type="dxa" w:w="110"/>
-              <w:right w:type="dxa" w:w="140"/>
-            </w:tcMar>
-          </w:tcPr>
-          <w:p/>
-          <w:p/>
-        </w:tc>
-      </w:tr>
-      <w:tr>
-        <w:tc>
-          <w:tcPr>
-            <w:tcW w:type="dxa" w:w="620"/>
-            <w:shd w:fill="F7F9FC" w:val="clear"/>
-            <w:tcMar>
-              <w:top w:type="dxa" w:w="110"/>
-              <w:left w:type="dxa" w:w="140"/>
-              <w:bottom w:type="dxa" w:w="110"/>
-              <w:right w:type="dxa" w:w="140"/>
-            </w:tcMar>
-          </w:tcPr>
-          <w:p>
-            <w:r>
-              <w:rPr>
-                <w:b/>
-                <w:bCs/>
-                <w:sz w:val="20"/>
-                <w:szCs w:val="20"/>
-              </w:rPr>
-              <w:t xml:space="preserve">17</w:t>
-            </w:r>
-          </w:p>
-        </w:tc>
-        <w:tc>
-          <w:tcPr>
-            <w:tcW w:type="dxa" w:w="4400"/>
-            <w:shd w:fill="F7F9FC" w:val="clear"/>
-            <w:tcMar>
-              <w:top w:type="dxa" w:w="110"/>
-              <w:left w:type="dxa" w:w="140"/>
-              <w:bottom w:type="dxa" w:w="110"/>
-              <w:right w:type="dxa" w:w="140"/>
-            </w:tcMar>
-          </w:tcPr>
-          <w:p>
-            <w:r>
-              <w:rPr>
-                <w:b w:val="false"/>
-                <w:bCs w:val="false"/>
-                <w:sz w:val="20"/>
-                <w:szCs w:val="20"/>
-              </w:rPr>
-              <w:t xml:space="preserve">Is there anything that happens only at end of financial year, or only in certain months, that I should know is coming?</w:t>
-            </w:r>
-          </w:p>
-        </w:tc>
-        <w:tc>
-          <w:tcPr>
-            <w:tcW w:type="dxa" w:w="4340"/>
-            <w:shd w:fill="F7F9FC" w:val="clear"/>
-            <w:tcMar>
-              <w:top w:type="dxa" w:w="110"/>
-              <w:left w:type="dxa" w:w="140"/>
-              <w:bottom w:type="dxa" w:w="110"/>
-              <w:right w:type="dxa" w:w="140"/>
-            </w:tcMar>
-          </w:tcPr>
-          <w:p/>
-          <w:p/>
+        <w:tc>
+          <w:tcPr>
+            <w:tcW w:type="dxa" w:w="9360"/>
+            <w:shd w:fill="F2F6FB" w:val="clear"/>
+            <w:tcMar>
+              <w:top w:type="dxa" w:w="120"/>
+              <w:left w:type="dxa" w:w="180"/>
+              <w:bottom w:type="dxa" w:w="120"/>
+              <w:right w:type="dxa" w:w="180"/>
+            </w:tcMar>
+          </w:tcPr>
+          <w:p>
+            <w:r>
+              <w:rPr>
+                <w:b/>
+                <w:bCs/>
+                <w:color w:val="1F4E79"/>
+                <w:sz w:val="22"/>
+                <w:szCs w:val="22"/>
+              </w:rPr>
+              <w:t xml:space="preserve">Parental leave is already settled.  </w:t>
+            </w:r>
+            <w:r>
+              <w:rPr>
+                <w:sz w:val="22"/>
+                <w:szCs w:val="22"/>
+              </w:rPr>
+              <w:t xml:space="preserve">There is no parental leave policy and it is unpaid. Staff take it as either annual leave or leave without pay. Where it is taken as leave without pay, follow Part 3c - including the rounding rule, which pushes a short day back up to eight hours for salaried staff and will overpay them if it is not corrected.</w:t>
+            </w:r>
+          </w:p>
         </w:tc>
       </w:tr>
     </w:tbl>
@@ -1657,50 +1177,6 @@
       <w:pPr>
         <w:spacing w:after="200"/>
       </w:pPr>
-    </w:p>
-    <w:p>
-      <w:pPr>
-        <w:pStyle w:val="Heading1"/>
-        <w:spacing w:after="160" w:before="360"/>
-      </w:pPr>
-      <w:r>
-        <w:rPr>
-          <w:b/>
-          <w:bCs/>
-          <w:color w:val="1F4E79"/>
-          <w:sz w:val="28"/>
-          <w:szCs w:val="28"/>
-        </w:rPr>
-        <w:t xml:space="preserve">Priority 2 — Confirm the rules</w:t>
-      </w:r>
-    </w:p>
-    <w:p>
-      <w:pPr>
-        <w:pStyle w:val="Heading2"/>
-        <w:spacing w:after="160" w:before="360"/>
-      </w:pPr>
-      <w:r>
-        <w:rPr>
-          <w:b/>
-          <w:bCs/>
-          <w:color w:val="1F4E79"/>
-          <w:sz w:val="24"/>
-          <w:szCs w:val="24"/>
-        </w:rPr>
-        <w:t xml:space="preserve">Award interpretation and rates</w:t>
-      </w:r>
-    </w:p>
-    <w:p>
-      <w:pPr>
-        <w:spacing w:after="120"/>
-      </w:pPr>
-      <w:r>
-        <w:rPr>
-          <w:sz w:val="22"/>
-          <w:szCs w:val="22"/>
-        </w:rPr>
-        <w:t xml:space="preserve">Several rules were stated on camera with audible uncertainty, or left as a judgement call without saying how to make it. These are the ones most likely to produce a wrong payment.</w:t>
-      </w:r>
     </w:p>
     <w:tbl>
       <w:tblPr>
@@ -1816,7 +1292,7 @@
                 <w:sz w:val="20"/>
                 <w:szCs w:val="20"/>
               </w:rPr>
-              <w:t xml:space="preserve">18</w:t>
+              <w:t xml:space="preserve">11</w:t>
             </w:r>
           </w:p>
         </w:tc>
@@ -1839,7 +1315,7 @@
                 <w:sz w:val="20"/>
                 <w:szCs w:val="20"/>
               </w:rPr>
-              <w:t xml:space="preserve">When Employment Hero triggers both daily overtime (over 8 hours) and weekly overtime (over 38 hours) for the same casual, which do I keep? The recording says 'we can choose to pay one of them' — is there a rule, or is it judgement, and what should I default to?</w:t>
+              <w:t xml:space="preserve">How is a termination handled? Final pay, unused annual leave payout, time in lieu balance, and what changes on the last pay run.</w:t>
             </w:r>
           </w:p>
         </w:tc>
@@ -1878,7 +1354,7 @@
                 <w:sz w:val="20"/>
                 <w:szCs w:val="20"/>
               </w:rPr>
-              <w:t xml:space="preserve">19</w:t>
+              <w:t xml:space="preserve">12</w:t>
             </w:r>
           </w:p>
         </w:tc>
@@ -1901,7 +1377,7 @@
                 <w:sz w:val="20"/>
                 <w:szCs w:val="20"/>
               </w:rPr>
-              <w:t xml:space="preserve">The no-meal-break penalty was described as 2.25 with some hesitation, and calculated rather than read from the award. Can we confirm the correct multiplier and where it sits in the award?</w:t>
+              <w:t xml:space="preserve">The Create Pay Run screen has an 'Include terminated employees' checkbox that we always leave unticked. When would it need ticking?</w:t>
             </w:r>
           </w:p>
         </w:tc>
@@ -1940,7 +1416,7 @@
                 <w:sz w:val="20"/>
                 <w:szCs w:val="20"/>
               </w:rPr>
-              <w:t xml:space="preserve">20</w:t>
+              <w:t xml:space="preserve">13</w:t>
             </w:r>
           </w:p>
         </w:tc>
@@ -1963,7 +1439,7 @@
                 <w:sz w:val="20"/>
                 <w:szCs w:val="20"/>
               </w:rPr>
-              <w:t xml:space="preserve">What is the casual loading percentage, and which spreadsheet columns hold the rate excluding loading versus including it?</w:t>
+              <w:t xml:space="preserve">What does payroll need to do for a new starter's first pay — TFN declaration, super choice, anything that must be in place before they can be paid?</w:t>
             </w:r>
           </w:p>
         </w:tc>
@@ -2002,7 +1478,7 @@
                 <w:sz w:val="20"/>
                 <w:szCs w:val="20"/>
               </w:rPr>
-              <w:t xml:space="preserve">21</w:t>
+              <w:t xml:space="preserve">14</w:t>
             </w:r>
           </w:p>
         </w:tc>
@@ -2025,7 +1501,7 @@
                 <w:sz w:val="20"/>
                 <w:szCs w:val="20"/>
               </w:rPr>
-              <w:t xml:space="preserve">The salaried hourly rate formula divides by 1.12 to strip superannuation. What do I change when the superannuation guarantee rate changes?</w:t>
+              <w:t xml:space="preserve">What do I do if I find an error after the pay run is finalised and super has been paid?</w:t>
             </w:r>
           </w:p>
         </w:tc>
@@ -2064,7 +1540,7 @@
                 <w:sz w:val="20"/>
                 <w:szCs w:val="20"/>
               </w:rPr>
-              <w:t xml:space="preserve">22</w:t>
+              <w:t xml:space="preserve">15</w:t>
             </w:r>
           </w:p>
         </w:tc>
@@ -2087,7 +1563,7 @@
                 <w:sz w:val="20"/>
                 <w:szCs w:val="20"/>
               </w:rPr>
-              <w:t xml:space="preserve">Are there casual penalty rates for weekends or public holidays, and how would they show up in a pay run?</w:t>
+              <w:t xml:space="preserve">What happens if an employee's bank details are wrong and the payment bounces back?</w:t>
             </w:r>
           </w:p>
         </w:tc>
@@ -2126,7 +1602,7 @@
                 <w:sz w:val="20"/>
                 <w:szCs w:val="20"/>
               </w:rPr>
-              <w:t xml:space="preserve">23</w:t>
+              <w:t xml:space="preserve">16</w:t>
             </w:r>
           </w:p>
         </w:tc>
@@ -2149,7 +1625,7 @@
                 <w:sz w:val="20"/>
                 <w:szCs w:val="20"/>
               </w:rPr>
-              <w:t xml:space="preserve">The overtime matrix on file is headed 'FULL TIME STAFF'. Is there an equivalent for part-time employees, or are they treated another way?</w:t>
+              <w:t xml:space="preserve">Is there anything that happens only at end of financial year, or only in certain months, that I should know is coming?</w:t>
             </w:r>
           </w:p>
         </w:tc>
@@ -2168,73 +1644,27 @@
           <w:p/>
         </w:tc>
       </w:tr>
-      <w:tr>
-        <w:tc>
-          <w:tcPr>
-            <w:tcW w:type="dxa" w:w="620"/>
-            <w:shd w:fill="F7F9FC" w:val="clear"/>
-            <w:tcMar>
-              <w:top w:type="dxa" w:w="110"/>
-              <w:left w:type="dxa" w:w="140"/>
-              <w:bottom w:type="dxa" w:w="110"/>
-              <w:right w:type="dxa" w:w="140"/>
-            </w:tcMar>
-          </w:tcPr>
-          <w:p>
-            <w:r>
-              <w:rPr>
-                <w:b/>
-                <w:bCs/>
-                <w:sz w:val="20"/>
-                <w:szCs w:val="20"/>
-              </w:rPr>
-              <w:t xml:space="preserve">24</w:t>
-            </w:r>
-          </w:p>
-        </w:tc>
-        <w:tc>
-          <w:tcPr>
-            <w:tcW w:type="dxa" w:w="4400"/>
-            <w:shd w:fill="F7F9FC" w:val="clear"/>
-            <w:tcMar>
-              <w:top w:type="dxa" w:w="110"/>
-              <w:left w:type="dxa" w:w="140"/>
-              <w:bottom w:type="dxa" w:w="110"/>
-              <w:right w:type="dxa" w:w="140"/>
-            </w:tcMar>
-          </w:tcPr>
-          <w:p>
-            <w:r>
-              <w:rPr>
-                <w:b w:val="false"/>
-                <w:bCs w:val="false"/>
-                <w:sz w:val="20"/>
-                <w:szCs w:val="20"/>
-              </w:rPr>
-              <w:t xml:space="preserve">What exactly makes work 'chargeable to the client' for the matrix's dollar columns — is that always the manager's call, or is there a rule I can apply?</w:t>
-            </w:r>
-          </w:p>
-        </w:tc>
-        <w:tc>
-          <w:tcPr>
-            <w:tcW w:type="dxa" w:w="4340"/>
-            <w:shd w:fill="F7F9FC" w:val="clear"/>
-            <w:tcMar>
-              <w:top w:type="dxa" w:w="110"/>
-              <w:left w:type="dxa" w:w="140"/>
-              <w:bottom w:type="dxa" w:w="110"/>
-              <w:right w:type="dxa" w:w="140"/>
-            </w:tcMar>
-          </w:tcPr>
-          <w:p/>
-          <w:p/>
-        </w:tc>
-      </w:tr>
     </w:tbl>
     <w:p>
       <w:pPr>
         <w:spacing w:after="200"/>
       </w:pPr>
+    </w:p>
+    <w:p>
+      <w:pPr>
+        <w:pStyle w:val="Heading1"/>
+        <w:spacing w:after="160" w:before="360"/>
+      </w:pPr>
+      <w:r>
+        <w:rPr>
+          <w:b/>
+          <w:bCs/>
+          <w:color w:val="1F4E79"/>
+          <w:sz w:val="28"/>
+          <w:szCs w:val="28"/>
+        </w:rPr>
+        <w:t xml:space="preserve">Priority 2 — Confirm the rules</w:t>
+      </w:r>
     </w:p>
     <w:p>
       <w:pPr>
@@ -2249,7 +1679,19 @@
           <w:sz w:val="24"/>
           <w:szCs w:val="24"/>
         </w:rPr>
-        <w:t xml:space="preserve">The timesheet spreadsheet</w:t>
+        <w:t xml:space="preserve">Award interpretation and rates</w:t>
+      </w:r>
+    </w:p>
+    <w:p>
+      <w:pPr>
+        <w:spacing w:after="120"/>
+      </w:pPr>
+      <w:r>
+        <w:rPr>
+          <w:sz w:val="22"/>
+          <w:szCs w:val="22"/>
+        </w:rPr>
+        <w:t xml:space="preserve">Several rules were stated on camera with audible uncertainty, or left as a judgement call without saying how to make it. These are the ones most likely to produce a wrong payment.</w:t>
       </w:r>
     </w:p>
     <w:tbl>
@@ -2366,7 +1808,7 @@
                 <w:sz w:val="20"/>
                 <w:szCs w:val="20"/>
               </w:rPr>
-              <w:t xml:space="preserve">25</w:t>
+              <w:t xml:space="preserve">17</w:t>
             </w:r>
           </w:p>
         </w:tc>
@@ -2389,7 +1831,7 @@
                 <w:sz w:val="20"/>
                 <w:szCs w:val="20"/>
               </w:rPr>
-              <w:t xml:space="preserve">Is the populated range columns E to S or F to S? Both were said during the recordings and I want to be sure which drives the formula.</w:t>
+              <w:t xml:space="preserve">When Employment Hero triggers both daily overtime (over 8 hours) and weekly overtime (over 38 hours) for the same casual, which do I keep? The recording says 'we can choose to pay one of them' — is there a rule, or is it judgement, and what should I default to?</w:t>
             </w:r>
           </w:p>
         </w:tc>
@@ -2428,7 +1870,7 @@
                 <w:sz w:val="20"/>
                 <w:szCs w:val="20"/>
               </w:rPr>
-              <w:t xml:space="preserve">26</w:t>
+              <w:t xml:space="preserve">18</w:t>
             </w:r>
           </w:p>
         </w:tc>
@@ -2451,7 +1893,7 @@
                 <w:sz w:val="20"/>
                 <w:szCs w:val="20"/>
               </w:rPr>
-              <w:t xml:space="preserve">The total hours column does not handle leave without pay correctly — this was found during recording and left unresolved. Has it been fixed, and if not what is the manual workaround?</w:t>
+              <w:t xml:space="preserve">The no-meal-break penalty was described as 2.25 with some hesitation, and calculated rather than read from the award. Can we confirm the correct multiplier and where it sits in the award?</w:t>
             </w:r>
           </w:p>
         </w:tc>
@@ -2490,7 +1932,7 @@
                 <w:sz w:val="20"/>
                 <w:szCs w:val="20"/>
               </w:rPr>
-              <w:t xml:space="preserve">27</w:t>
+              <w:t xml:space="preserve">19</w:t>
             </w:r>
           </w:p>
         </w:tc>
@@ -2513,7 +1955,7 @@
                 <w:sz w:val="20"/>
                 <w:szCs w:val="20"/>
               </w:rPr>
-              <w:t xml:space="preserve">When are the Public Holiday and Jury Leave columns used, and where do those hours come from?</w:t>
+              <w:t xml:space="preserve">What is the casual loading percentage, and which spreadsheet columns hold the rate excluding loading versus including it?</w:t>
             </w:r>
           </w:p>
         </w:tc>
@@ -2552,7 +1994,7 @@
                 <w:sz w:val="20"/>
                 <w:szCs w:val="20"/>
               </w:rPr>
-              <w:t xml:space="preserve">28</w:t>
+              <w:t xml:space="preserve">20</w:t>
             </w:r>
           </w:p>
         </w:tc>
@@ -2575,7 +2017,7 @@
                 <w:sz w:val="20"/>
                 <w:szCs w:val="20"/>
               </w:rPr>
-              <w:t xml:space="preserve">The Rate Check column shows #VALUE! against some employees. Is that expected, or does it indicate a problem?</w:t>
+              <w:t xml:space="preserve">The salaried hourly rate formula divides by 1.12 to strip superannuation. What do I change when the superannuation guarantee rate changes?</w:t>
             </w:r>
           </w:p>
         </w:tc>
@@ -2614,7 +2056,7 @@
                 <w:sz w:val="20"/>
                 <w:szCs w:val="20"/>
               </w:rPr>
-              <w:t xml:space="preserve">29</w:t>
+              <w:t xml:space="preserve">21</w:t>
             </w:r>
           </w:p>
         </w:tc>
@@ -2637,7 +2079,7 @@
                 <w:sz w:val="20"/>
                 <w:szCs w:val="20"/>
               </w:rPr>
-              <w:t xml:space="preserve">Does green highlighting mean 'rate verified this fortnight' or 'rate was changed'? Both readings came up, and I want to use it consistently.</w:t>
+              <w:t xml:space="preserve">Are there casual penalty rates for weekends or public holidays, and how would they show up in a pay run?</w:t>
             </w:r>
           </w:p>
         </w:tc>
@@ -2676,7 +2118,7 @@
                 <w:sz w:val="20"/>
                 <w:szCs w:val="20"/>
               </w:rPr>
-              <w:t xml:space="preserve">30</w:t>
+              <w:t xml:space="preserve">22</w:t>
             </w:r>
           </w:p>
         </w:tc>
@@ -2699,7 +2141,7 @@
                 <w:sz w:val="20"/>
                 <w:szCs w:val="20"/>
               </w:rPr>
-              <w:t xml:space="preserve">How far ahead is the Lookup tab populated with pay periods, and who extends it when it runs out?</w:t>
+              <w:t xml:space="preserve">The overtime matrix on file is headed 'FULL TIME STAFF'. Is there an equivalent for part-time employees, or are they treated another way?</w:t>
             </w:r>
           </w:p>
         </w:tc>
@@ -2738,7 +2180,7 @@
                 <w:sz w:val="20"/>
                 <w:szCs w:val="20"/>
               </w:rPr>
-              <w:t xml:space="preserve">31</w:t>
+              <w:t xml:space="preserve">23</w:t>
             </w:r>
           </w:p>
         </w:tc>
@@ -2761,7 +2203,7 @@
                 <w:sz w:val="20"/>
                 <w:szCs w:val="20"/>
               </w:rPr>
-              <w:t xml:space="preserve">Is the template ever updated between fortnights, or do I always copy the same one?</w:t>
+              <w:t xml:space="preserve">What exactly makes work 'chargeable to the client' for the matrix's dollar columns — is that always the manager's call, or is there a rule I can apply?</w:t>
             </w:r>
           </w:p>
         </w:tc>
@@ -2799,7 +2241,7 @@
           <w:sz w:val="24"/>
           <w:szCs w:val="24"/>
         </w:rPr>
-        <w:t xml:space="preserve">Calendar and timing</w:t>
+        <w:t xml:space="preserve">The timesheet spreadsheet</w:t>
       </w:r>
     </w:p>
     <w:tbl>
@@ -2916,7 +2358,7 @@
                 <w:sz w:val="20"/>
                 <w:szCs w:val="20"/>
               </w:rPr>
-              <w:t xml:space="preserve">32</w:t>
+              <w:t xml:space="preserve">24</w:t>
             </w:r>
           </w:p>
         </w:tc>
@@ -2939,7 +2381,7 @@
                 <w:sz w:val="20"/>
                 <w:szCs w:val="20"/>
               </w:rPr>
-              <w:t xml:space="preserve">What happens when the Monday of the processing week, or the Tuesday pay date, falls on a public holiday?</w:t>
+              <w:t xml:space="preserve">Is the populated range columns E to S or F to S? Both were said during the recordings and I want to be sure which drives the formula.</w:t>
             </w:r>
           </w:p>
         </w:tc>
@@ -2978,7 +2420,7 @@
                 <w:sz w:val="20"/>
                 <w:szCs w:val="20"/>
               </w:rPr>
-              <w:t xml:space="preserve">33</w:t>
+              <w:t xml:space="preserve">25</w:t>
             </w:r>
           </w:p>
         </w:tc>
@@ -3001,7 +2443,7 @@
                 <w:sz w:val="20"/>
                 <w:szCs w:val="20"/>
               </w:rPr>
-              <w:t xml:space="preserve">How do I know a given fortnight is the last pay run of the month for bonus leave accrual, particularly when a fortnight straddles month end?</w:t>
+              <w:t xml:space="preserve">The total hours column does not handle leave without pay correctly — this was found during recording and left unresolved. Has it been fixed, and if not what is the manual workaround?</w:t>
             </w:r>
           </w:p>
         </w:tc>
@@ -3040,7 +2482,7 @@
                 <w:sz w:val="20"/>
                 <w:szCs w:val="20"/>
               </w:rPr>
-              <w:t xml:space="preserve">34</w:t>
+              <w:t xml:space="preserve">26</w:t>
             </w:r>
           </w:p>
         </w:tc>
@@ -3063,7 +2505,7 @@
                 <w:sz w:val="20"/>
                 <w:szCs w:val="20"/>
               </w:rPr>
-              <w:t xml:space="preserve">Is there a cut-off published to staff for timesheet submission, and who enforces it?</w:t>
+              <w:t xml:space="preserve">When are the Public Holiday and Jury Leave columns used, and where do those hours come from?</w:t>
             </w:r>
           </w:p>
         </w:tc>
@@ -3102,7 +2544,7 @@
                 <w:sz w:val="20"/>
                 <w:szCs w:val="20"/>
               </w:rPr>
-              <w:t xml:space="preserve">35</w:t>
+              <w:t xml:space="preserve">27</w:t>
             </w:r>
           </w:p>
         </w:tc>
@@ -3125,7 +2567,7 @@
                 <w:sz w:val="20"/>
                 <w:szCs w:val="20"/>
               </w:rPr>
-              <w:t xml:space="preserve">How long before pay day does the money actually need to be in the account?</w:t>
+              <w:t xml:space="preserve">The Rate Check column shows #VALUE! against some employees. Is that expected, or does it indicate a problem?</w:t>
             </w:r>
           </w:p>
         </w:tc>
@@ -3144,6 +2586,130 @@
           <w:p/>
         </w:tc>
       </w:tr>
+      <w:tr>
+        <w:tc>
+          <w:tcPr>
+            <w:tcW w:type="dxa" w:w="620"/>
+            <w:shd w:fill="F7F9FC" w:val="clear"/>
+            <w:tcMar>
+              <w:top w:type="dxa" w:w="110"/>
+              <w:left w:type="dxa" w:w="140"/>
+              <w:bottom w:type="dxa" w:w="110"/>
+              <w:right w:type="dxa" w:w="140"/>
+            </w:tcMar>
+          </w:tcPr>
+          <w:p>
+            <w:r>
+              <w:rPr>
+                <w:b/>
+                <w:bCs/>
+                <w:sz w:val="20"/>
+                <w:szCs w:val="20"/>
+              </w:rPr>
+              <w:t xml:space="preserve">28</w:t>
+            </w:r>
+          </w:p>
+        </w:tc>
+        <w:tc>
+          <w:tcPr>
+            <w:tcW w:type="dxa" w:w="4400"/>
+            <w:shd w:fill="F7F9FC" w:val="clear"/>
+            <w:tcMar>
+              <w:top w:type="dxa" w:w="110"/>
+              <w:left w:type="dxa" w:w="140"/>
+              <w:bottom w:type="dxa" w:w="110"/>
+              <w:right w:type="dxa" w:w="140"/>
+            </w:tcMar>
+          </w:tcPr>
+          <w:p>
+            <w:r>
+              <w:rPr>
+                <w:b w:val="false"/>
+                <w:bCs w:val="false"/>
+                <w:sz w:val="20"/>
+                <w:szCs w:val="20"/>
+              </w:rPr>
+              <w:t xml:space="preserve">Does green highlighting mean 'rate verified this fortnight' or 'rate was changed'? Both readings came up, and I want to use it consistently.</w:t>
+            </w:r>
+          </w:p>
+        </w:tc>
+        <w:tc>
+          <w:tcPr>
+            <w:tcW w:type="dxa" w:w="4340"/>
+            <w:shd w:fill="F7F9FC" w:val="clear"/>
+            <w:tcMar>
+              <w:top w:type="dxa" w:w="110"/>
+              <w:left w:type="dxa" w:w="140"/>
+              <w:bottom w:type="dxa" w:w="110"/>
+              <w:right w:type="dxa" w:w="140"/>
+            </w:tcMar>
+          </w:tcPr>
+          <w:p/>
+          <w:p/>
+        </w:tc>
+      </w:tr>
+      <w:tr>
+        <w:tc>
+          <w:tcPr>
+            <w:tcW w:type="dxa" w:w="620"/>
+            <w:shd w:fill="FFFFFF" w:val="clear"/>
+            <w:tcMar>
+              <w:top w:type="dxa" w:w="110"/>
+              <w:left w:type="dxa" w:w="140"/>
+              <w:bottom w:type="dxa" w:w="110"/>
+              <w:right w:type="dxa" w:w="140"/>
+            </w:tcMar>
+          </w:tcPr>
+          <w:p>
+            <w:r>
+              <w:rPr>
+                <w:b/>
+                <w:bCs/>
+                <w:sz w:val="20"/>
+                <w:szCs w:val="20"/>
+              </w:rPr>
+              <w:t xml:space="preserve">29</w:t>
+            </w:r>
+          </w:p>
+        </w:tc>
+        <w:tc>
+          <w:tcPr>
+            <w:tcW w:type="dxa" w:w="4400"/>
+            <w:shd w:fill="FFFFFF" w:val="clear"/>
+            <w:tcMar>
+              <w:top w:type="dxa" w:w="110"/>
+              <w:left w:type="dxa" w:w="140"/>
+              <w:bottom w:type="dxa" w:w="110"/>
+              <w:right w:type="dxa" w:w="140"/>
+            </w:tcMar>
+          </w:tcPr>
+          <w:p>
+            <w:r>
+              <w:rPr>
+                <w:b w:val="false"/>
+                <w:bCs w:val="false"/>
+                <w:sz w:val="20"/>
+                <w:szCs w:val="20"/>
+              </w:rPr>
+              <w:t xml:space="preserve">How far ahead is the Lookup tab populated with pay periods, and who extends it when it runs out?</w:t>
+            </w:r>
+          </w:p>
+        </w:tc>
+        <w:tc>
+          <w:tcPr>
+            <w:tcW w:type="dxa" w:w="4340"/>
+            <w:shd w:fill="FFFFFF" w:val="clear"/>
+            <w:tcMar>
+              <w:top w:type="dxa" w:w="110"/>
+              <w:left w:type="dxa" w:w="140"/>
+              <w:bottom w:type="dxa" w:w="110"/>
+              <w:right w:type="dxa" w:w="140"/>
+            </w:tcMar>
+          </w:tcPr>
+          <w:p/>
+          <w:p/>
+        </w:tc>
+      </w:tr>
     </w:tbl>
     <w:p>
       <w:pPr>
@@ -3152,7 +2718,7 @@
     </w:p>
     <w:p>
       <w:pPr>
-        <w:pStyle w:val="Heading1"/>
+        <w:pStyle w:val="Heading2"/>
         <w:spacing w:after="160" w:before="360"/>
       </w:pPr>
       <w:r>
@@ -3160,11 +2726,65 @@
           <w:b/>
           <w:bCs/>
           <w:color w:val="1F4E79"/>
-          <w:sz w:val="28"/>
-          <w:szCs w:val="28"/>
-        </w:rPr>
-        <w:t xml:space="preserve">Priority 3 — Worth having</w:t>
-      </w:r>
+          <w:sz w:val="24"/>
+          <w:szCs w:val="24"/>
+        </w:rPr>
+        <w:t xml:space="preserve">Calendar and timing</w:t>
+      </w:r>
+    </w:p>
+    <w:tbl>
+      <w:tblPr>
+        <w:tblW w:type="auto" w:w="100"/>
+        <w:tblBorders>
+          <w:top w:val="single" w:color="D0D7E5" w:sz="2"/>
+          <w:left w:val="single" w:color="1F4E79" w:sz="18"/>
+          <w:bottom w:val="single" w:color="D0D7E5" w:sz="2"/>
+          <w:right w:val="single" w:color="D0D7E5" w:sz="2"/>
+          <w:insideH w:val="none"/>
+          <w:insideV w:val="none"/>
+        </w:tblBorders>
+      </w:tblPr>
+      <w:tblGrid>
+        <w:gridCol w:w="9360"/>
+      </w:tblGrid>
+      <w:tr>
+        <w:tc>
+          <w:tcPr>
+            <w:tcW w:type="dxa" w:w="9360"/>
+            <w:shd w:fill="F2F6FB" w:val="clear"/>
+            <w:tcMar>
+              <w:top w:type="dxa" w:w="120"/>
+              <w:left w:type="dxa" w:w="180"/>
+              <w:bottom w:type="dxa" w:w="120"/>
+              <w:right w:type="dxa" w:w="180"/>
+            </w:tcMar>
+          </w:tcPr>
+          <w:p>
+            <w:r>
+              <w:rPr>
+                <w:b/>
+                <w:bCs/>
+                <w:color w:val="1F4E79"/>
+                <w:sz w:val="22"/>
+                <w:szCs w:val="22"/>
+              </w:rPr>
+              <w:t xml:space="preserve">The timesheet cut-off is 10am Monday.  </w:t>
+            </w:r>
+            <w:r>
+              <w:rPr>
+                <w:sz w:val="22"/>
+                <w:szCs w:val="22"/>
+              </w:rPr>
+              <w:t xml:space="preserve">Staff must have timesheets in by 10am on the Monday of the processing week.</w:t>
+            </w:r>
+          </w:p>
+        </w:tc>
+      </w:tr>
+    </w:tbl>
+    <w:p>
+      <w:pPr>
+        <w:spacing w:after="200"/>
+      </w:pPr>
     </w:p>
     <w:tbl>
       <w:tblPr>
@@ -3280,7 +2900,7 @@
                 <w:sz w:val="20"/>
                 <w:szCs w:val="20"/>
               </w:rPr>
-              <w:t xml:space="preserve">36</w:t>
+              <w:t xml:space="preserve">30</w:t>
             </w:r>
           </w:p>
         </w:tc>
@@ -3303,7 +2923,7 @@
                 <w:sz w:val="20"/>
                 <w:szCs w:val="20"/>
               </w:rPr>
-              <w:t xml:space="preserve">Employment Hero has a known fault where a rate updated in HR does not reach payroll. Is there an open support ticket, and who is our contact there?</w:t>
+              <w:t xml:space="preserve">What happens when the Monday of the processing week, or the Tuesday pay date, falls on a public holiday?</w:t>
             </w:r>
           </w:p>
         </w:tc>
@@ -3342,7 +2962,7 @@
                 <w:sz w:val="20"/>
                 <w:szCs w:val="20"/>
               </w:rPr>
-              <w:t xml:space="preserve">37</w:t>
+              <w:t xml:space="preserve">31</w:t>
             </w:r>
           </w:p>
         </w:tc>
@@ -3365,7 +2985,7 @@
                 <w:sz w:val="20"/>
                 <w:szCs w:val="20"/>
               </w:rPr>
-              <w:t xml:space="preserve">Where are bonus leave letters stored, and who issues them? Accruals are blocked until a letter is signed.</w:t>
+              <w:t xml:space="preserve">How do I know a given fortnight is the last pay run of the month for bonus leave accrual, particularly when a fortnight straddles month end?</w:t>
             </w:r>
           </w:p>
         </w:tc>
@@ -3404,7 +3024,7 @@
                 <w:sz w:val="20"/>
                 <w:szCs w:val="20"/>
               </w:rPr>
-              <w:t xml:space="preserve">38</w:t>
+              <w:t xml:space="preserve">32</w:t>
             </w:r>
           </w:p>
         </w:tc>
@@ -3427,7 +3047,7 @@
                 <w:sz w:val="20"/>
                 <w:szCs w:val="20"/>
               </w:rPr>
-              <w:t xml:space="preserve">What is the process when an employee queries their pay after pay day?</w:t>
+              <w:t xml:space="preserve">How long before pay day does the money actually need to be in the account?</w:t>
             </w:r>
           </w:p>
         </w:tc>
@@ -3446,34 +3066,150 @@
           <w:p/>
         </w:tc>
       </w:tr>
-      <w:tr>
+    </w:tbl>
+    <w:p>
+      <w:pPr>
+        <w:spacing w:after="200"/>
+      </w:pPr>
+    </w:p>
+    <w:p>
+      <w:pPr>
+        <w:pStyle w:val="Heading1"/>
+        <w:spacing w:after="160" w:before="360"/>
+      </w:pPr>
+      <w:r>
+        <w:rPr>
+          <w:b/>
+          <w:bCs/>
+          <w:color w:val="1F4E79"/>
+          <w:sz w:val="28"/>
+          <w:szCs w:val="28"/>
+        </w:rPr>
+        <w:t xml:space="preserve">Priority 3 — Worth having</w:t>
+      </w:r>
+    </w:p>
+    <w:tbl>
+      <w:tblPr>
+        <w:tblW w:type="auto" w:w="100"/>
+        <w:tblBorders>
+          <w:top w:val="single" w:color="auto" w:sz="4"/>
+          <w:left w:val="single" w:color="auto" w:sz="4"/>
+          <w:bottom w:val="single" w:color="auto" w:sz="4"/>
+          <w:right w:val="single" w:color="auto" w:sz="4"/>
+          <w:insideH w:val="single" w:color="auto" w:sz="4"/>
+          <w:insideV w:val="single" w:color="auto" w:sz="4"/>
+        </w:tblBorders>
+      </w:tblPr>
+      <w:tblGrid>
+        <w:gridCol w:w="620"/>
+        <w:gridCol w:w="4400"/>
+        <w:gridCol w:w="4340"/>
+      </w:tblGrid>
+      <w:tr>
+        <w:trPr>
+          <w:tblHeader/>
+        </w:trPr>
         <w:tc>
           <w:tcPr>
             <w:tcW w:type="dxa" w:w="620"/>
-            <w:shd w:fill="FFFFFF" w:val="clear"/>
-            <w:tcMar>
-              <w:top w:type="dxa" w:w="110"/>
-              <w:left w:type="dxa" w:w="140"/>
-              <w:bottom w:type="dxa" w:w="110"/>
-              <w:right w:type="dxa" w:w="140"/>
-            </w:tcMar>
-          </w:tcPr>
-          <w:p>
-            <w:r>
-              <w:rPr>
-                <w:b/>
-                <w:bCs/>
-                <w:sz w:val="20"/>
-                <w:szCs w:val="20"/>
-              </w:rPr>
-              <w:t xml:space="preserve">39</w:t>
+            <w:shd w:fill="1F4E79" w:val="clear"/>
+            <w:tcMar>
+              <w:top w:type="dxa" w:w="110"/>
+              <w:left w:type="dxa" w:w="140"/>
+              <w:bottom w:type="dxa" w:w="110"/>
+              <w:right w:type="dxa" w:w="140"/>
+            </w:tcMar>
+          </w:tcPr>
+          <w:p>
+            <w:r>
+              <w:rPr>
+                <w:b/>
+                <w:bCs/>
+                <w:color w:val="FFFFFF"/>
+                <w:sz w:val="20"/>
+                <w:szCs w:val="20"/>
+              </w:rPr>
+              <w:t xml:space="preserve">#</w:t>
             </w:r>
           </w:p>
         </w:tc>
         <w:tc>
           <w:tcPr>
             <w:tcW w:type="dxa" w:w="4400"/>
-            <w:shd w:fill="FFFFFF" w:val="clear"/>
+            <w:shd w:fill="1F4E79" w:val="clear"/>
+            <w:tcMar>
+              <w:top w:type="dxa" w:w="110"/>
+              <w:left w:type="dxa" w:w="140"/>
+              <w:bottom w:type="dxa" w:w="110"/>
+              <w:right w:type="dxa" w:w="140"/>
+            </w:tcMar>
+          </w:tcPr>
+          <w:p>
+            <w:r>
+              <w:rPr>
+                <w:b/>
+                <w:bCs/>
+                <w:color w:val="FFFFFF"/>
+                <w:sz w:val="20"/>
+                <w:szCs w:val="20"/>
+              </w:rPr>
+              <w:t xml:space="preserve">Question</w:t>
+            </w:r>
+          </w:p>
+        </w:tc>
+        <w:tc>
+          <w:tcPr>
+            <w:tcW w:type="dxa" w:w="4340"/>
+            <w:shd w:fill="1F4E79" w:val="clear"/>
+            <w:tcMar>
+              <w:top w:type="dxa" w:w="110"/>
+              <w:left w:type="dxa" w:w="140"/>
+              <w:bottom w:type="dxa" w:w="110"/>
+              <w:right w:type="dxa" w:w="140"/>
+            </w:tcMar>
+          </w:tcPr>
+          <w:p>
+            <w:r>
+              <w:rPr>
+                <w:b/>
+                <w:bCs/>
+                <w:color w:val="FFFFFF"/>
+                <w:sz w:val="20"/>
+                <w:szCs w:val="20"/>
+              </w:rPr>
+              <w:t xml:space="preserve">Answer</w:t>
+            </w:r>
+          </w:p>
+        </w:tc>
+      </w:tr>
+      <w:tr>
+        <w:tc>
+          <w:tcPr>
+            <w:tcW w:type="dxa" w:w="620"/>
+            <w:shd w:fill="F7F9FC" w:val="clear"/>
+            <w:tcMar>
+              <w:top w:type="dxa" w:w="110"/>
+              <w:left w:type="dxa" w:w="140"/>
+              <w:bottom w:type="dxa" w:w="110"/>
+              <w:right w:type="dxa" w:w="140"/>
+            </w:tcMar>
+          </w:tcPr>
+          <w:p>
+            <w:r>
+              <w:rPr>
+                <w:b/>
+                <w:bCs/>
+                <w:sz w:val="20"/>
+                <w:szCs w:val="20"/>
+              </w:rPr>
+              <w:t xml:space="preserve">33</w:t>
+            </w:r>
+          </w:p>
+        </w:tc>
+        <w:tc>
+          <w:tcPr>
+            <w:tcW w:type="dxa" w:w="4400"/>
+            <w:shd w:fill="F7F9FC" w:val="clear"/>
             <w:tcMar>
               <w:top w:type="dxa" w:w="110"/>
               <w:left w:type="dxa" w:w="140"/>
@@ -3489,14 +3225,14 @@
                 <w:sz w:val="20"/>
                 <w:szCs w:val="20"/>
               </w:rPr>
-              <w:t xml:space="preserve">Are there any employees with unusual arrangements I should know about before I meet them in a pay run?</w:t>
+              <w:t xml:space="preserve">Where are bonus leave letters stored, and who issues them? Accruals are blocked until a letter is signed.</w:t>
             </w:r>
           </w:p>
         </w:tc>
         <w:tc>
           <w:tcPr>
             <w:tcW w:type="dxa" w:w="4340"/>
-            <w:shd w:fill="FFFFFF" w:val="clear"/>
+            <w:shd w:fill="F7F9FC" w:val="clear"/>
             <w:tcMar>
               <w:top w:type="dxa" w:w="110"/>
               <w:left w:type="dxa" w:w="140"/>
@@ -3512,30 +3248,30 @@
         <w:tc>
           <w:tcPr>
             <w:tcW w:type="dxa" w:w="620"/>
-            <w:shd w:fill="F7F9FC" w:val="clear"/>
-            <w:tcMar>
-              <w:top w:type="dxa" w:w="110"/>
-              <w:left w:type="dxa" w:w="140"/>
-              <w:bottom w:type="dxa" w:w="110"/>
-              <w:right w:type="dxa" w:w="140"/>
-            </w:tcMar>
-          </w:tcPr>
-          <w:p>
-            <w:r>
-              <w:rPr>
-                <w:b/>
-                <w:bCs/>
-                <w:sz w:val="20"/>
-                <w:szCs w:val="20"/>
-              </w:rPr>
-              <w:t xml:space="preserve">40</w:t>
+            <w:shd w:fill="FFFFFF" w:val="clear"/>
+            <w:tcMar>
+              <w:top w:type="dxa" w:w="110"/>
+              <w:left w:type="dxa" w:w="140"/>
+              <w:bottom w:type="dxa" w:w="110"/>
+              <w:right w:type="dxa" w:w="140"/>
+            </w:tcMar>
+          </w:tcPr>
+          <w:p>
+            <w:r>
+              <w:rPr>
+                <w:b/>
+                <w:bCs/>
+                <w:sz w:val="20"/>
+                <w:szCs w:val="20"/>
+              </w:rPr>
+              <w:t xml:space="preserve">34</w:t>
             </w:r>
           </w:p>
         </w:tc>
         <w:tc>
           <w:tcPr>
             <w:tcW w:type="dxa" w:w="4400"/>
-            <w:shd w:fill="F7F9FC" w:val="clear"/>
+            <w:shd w:fill="FFFFFF" w:val="clear"/>
             <w:tcMar>
               <w:top w:type="dxa" w:w="110"/>
               <w:left w:type="dxa" w:w="140"/>
@@ -3551,6 +3287,130 @@
                 <w:sz w:val="20"/>
                 <w:szCs w:val="20"/>
               </w:rPr>
+              <w:t xml:space="preserve">What is the process when an employee queries their pay after pay day?</w:t>
+            </w:r>
+          </w:p>
+        </w:tc>
+        <w:tc>
+          <w:tcPr>
+            <w:tcW w:type="dxa" w:w="4340"/>
+            <w:shd w:fill="FFFFFF" w:val="clear"/>
+            <w:tcMar>
+              <w:top w:type="dxa" w:w="110"/>
+              <w:left w:type="dxa" w:w="140"/>
+              <w:bottom w:type="dxa" w:w="110"/>
+              <w:right w:type="dxa" w:w="140"/>
+            </w:tcMar>
+          </w:tcPr>
+          <w:p/>
+          <w:p/>
+        </w:tc>
+      </w:tr>
+      <w:tr>
+        <w:tc>
+          <w:tcPr>
+            <w:tcW w:type="dxa" w:w="620"/>
+            <w:shd w:fill="F7F9FC" w:val="clear"/>
+            <w:tcMar>
+              <w:top w:type="dxa" w:w="110"/>
+              <w:left w:type="dxa" w:w="140"/>
+              <w:bottom w:type="dxa" w:w="110"/>
+              <w:right w:type="dxa" w:w="140"/>
+            </w:tcMar>
+          </w:tcPr>
+          <w:p>
+            <w:r>
+              <w:rPr>
+                <w:b/>
+                <w:bCs/>
+                <w:sz w:val="20"/>
+                <w:szCs w:val="20"/>
+              </w:rPr>
+              <w:t xml:space="preserve">35</w:t>
+            </w:r>
+          </w:p>
+        </w:tc>
+        <w:tc>
+          <w:tcPr>
+            <w:tcW w:type="dxa" w:w="4400"/>
+            <w:shd w:fill="F7F9FC" w:val="clear"/>
+            <w:tcMar>
+              <w:top w:type="dxa" w:w="110"/>
+              <w:left w:type="dxa" w:w="140"/>
+              <w:bottom w:type="dxa" w:w="110"/>
+              <w:right w:type="dxa" w:w="140"/>
+            </w:tcMar>
+          </w:tcPr>
+          <w:p>
+            <w:r>
+              <w:rPr>
+                <w:b w:val="false"/>
+                <w:bCs w:val="false"/>
+                <w:sz w:val="20"/>
+                <w:szCs w:val="20"/>
+              </w:rPr>
+              <w:t xml:space="preserve">Are there any employees with unusual arrangements I should know about before I meet them in a pay run?</w:t>
+            </w:r>
+          </w:p>
+        </w:tc>
+        <w:tc>
+          <w:tcPr>
+            <w:tcW w:type="dxa" w:w="4340"/>
+            <w:shd w:fill="F7F9FC" w:val="clear"/>
+            <w:tcMar>
+              <w:top w:type="dxa" w:w="110"/>
+              <w:left w:type="dxa" w:w="140"/>
+              <w:bottom w:type="dxa" w:w="110"/>
+              <w:right w:type="dxa" w:w="140"/>
+            </w:tcMar>
+          </w:tcPr>
+          <w:p/>
+          <w:p/>
+        </w:tc>
+      </w:tr>
+      <w:tr>
+        <w:tc>
+          <w:tcPr>
+            <w:tcW w:type="dxa" w:w="620"/>
+            <w:shd w:fill="FFFFFF" w:val="clear"/>
+            <w:tcMar>
+              <w:top w:type="dxa" w:w="110"/>
+              <w:left w:type="dxa" w:w="140"/>
+              <w:bottom w:type="dxa" w:w="110"/>
+              <w:right w:type="dxa" w:w="140"/>
+            </w:tcMar>
+          </w:tcPr>
+          <w:p>
+            <w:r>
+              <w:rPr>
+                <w:b/>
+                <w:bCs/>
+                <w:sz w:val="20"/>
+                <w:szCs w:val="20"/>
+              </w:rPr>
+              <w:t xml:space="preserve">36</w:t>
+            </w:r>
+          </w:p>
+        </w:tc>
+        <w:tc>
+          <w:tcPr>
+            <w:tcW w:type="dxa" w:w="4400"/>
+            <w:shd w:fill="FFFFFF" w:val="clear"/>
+            <w:tcMar>
+              <w:top w:type="dxa" w:w="110"/>
+              <w:left w:type="dxa" w:w="140"/>
+              <w:bottom w:type="dxa" w:w="110"/>
+              <w:right w:type="dxa" w:w="140"/>
+            </w:tcMar>
+          </w:tcPr>
+          <w:p>
+            <w:r>
+              <w:rPr>
+                <w:b w:val="false"/>
+                <w:bCs w:val="false"/>
+                <w:sz w:val="20"/>
+                <w:szCs w:val="20"/>
+              </w:rPr>
               <w:t xml:space="preserve">Is there anything you do out of habit that is not written down anywhere?</w:t>
             </w:r>
           </w:p>
@@ -3558,7 +3418,7 @@
         <w:tc>
           <w:tcPr>
             <w:tcW w:type="dxa" w:w="4340"/>
-            <w:shd w:fill="F7F9FC" w:val="clear"/>
+            <w:shd w:fill="FFFFFF" w:val="clear"/>
             <w:tcMar>
               <w:top w:type="dxa" w:w="110"/>
               <w:left w:type="dxa" w:w="140"/>
@@ -3921,7 +3781,7 @@
                 <w:sz w:val="22"/>
                 <w:szCs w:val="22"/>
               </w:rPr>
-              <w:t xml:space="preserve">What if the savings account cannot cover it either? Who authorises moving money from elsewhere, and how much notice do they need?</w:t>
+              <w:t xml:space="preserve">How much notice does the transfer need to clear before the payment is processed? Savings has always covered it, so the question is timing rather than availability.</w:t>
             </w:r>
           </w:p>
         </w:tc>

</xml_diff>

<commit_message>
Rewrite the handover for an unsupervised first pay run
The outgoing payroll officer will already be on leave when the next
fortnight runs, so the supervised practice run this document recommended is
not available. Replaces it with what actually helps in that situation:
capturing answers in writing before she goes, and having the three
escalation contacts to hand before starting rather than searching for them
under pressure.

Adds a question for the Employment Hero support contact, which matters more
without a colleague to ask. Drops four questions that are not needed.

Co-Authored-By: Claude Opus 5 <noreply@anthropic.com>
Claude-Session: https://claude.ai/code/session_01NGLPCmZEnLwWWew5jbH6qG
</commit_message>
<xml_diff>
--- a/manuals/Payroll Handover - Questions and Scenarios.docx
+++ b/manuals/Payroll Handover - Questions and Scenarios.docx
@@ -181,7 +181,7 @@
                 <w:sz w:val="22"/>
                 <w:szCs w:val="22"/>
               </w:rPr>
-              <w:t xml:space="preserve">Work through it with her in one or two sittings and write the answers in. Then hand the completed document back to me and I will fold the answers into the manuals, so the knowledge ends up in the procedure rather than in a separate file nobody opens.</w:t>
+              <w:t xml:space="preserve">Work through it with her before she finishes up and write the answers in. Then hand the completed document back to me and I will fold the answers into the manuals, so the knowledge ends up in the procedure rather than in a separate file nobody opens.</w:t>
             </w:r>
           </w:p>
         </w:tc>
@@ -509,7 +509,7 @@
                 <w:sz w:val="20"/>
                 <w:szCs w:val="20"/>
               </w:rPr>
-              <w:t xml:space="preserve">What are the company credit card details used for during payroll, and how do I get access to them?</w:t>
+              <w:t xml:space="preserve">Is there anything else I will need a login for that has not come up yet?</w:t>
             </w:r>
           </w:p>
         </w:tc>
@@ -517,68 +517,6 @@
           <w:tcPr>
             <w:tcW w:type="dxa" w:w="4340"/>
             <w:shd w:fill="F7F9FC" w:val="clear"/>
-            <w:tcMar>
-              <w:top w:type="dxa" w:w="110"/>
-              <w:left w:type="dxa" w:w="140"/>
-              <w:bottom w:type="dxa" w:w="110"/>
-              <w:right w:type="dxa" w:w="140"/>
-            </w:tcMar>
-          </w:tcPr>
-          <w:p/>
-          <w:p/>
-        </w:tc>
-      </w:tr>
-      <w:tr>
-        <w:tc>
-          <w:tcPr>
-            <w:tcW w:type="dxa" w:w="620"/>
-            <w:shd w:fill="FFFFFF" w:val="clear"/>
-            <w:tcMar>
-              <w:top w:type="dxa" w:w="110"/>
-              <w:left w:type="dxa" w:w="140"/>
-              <w:bottom w:type="dxa" w:w="110"/>
-              <w:right w:type="dxa" w:w="140"/>
-            </w:tcMar>
-          </w:tcPr>
-          <w:p>
-            <w:r>
-              <w:rPr>
-                <w:b/>
-                <w:bCs/>
-                <w:sz w:val="20"/>
-                <w:szCs w:val="20"/>
-              </w:rPr>
-              <w:t xml:space="preserve">4</w:t>
-            </w:r>
-          </w:p>
-        </w:tc>
-        <w:tc>
-          <w:tcPr>
-            <w:tcW w:type="dxa" w:w="4400"/>
-            <w:shd w:fill="FFFFFF" w:val="clear"/>
-            <w:tcMar>
-              <w:top w:type="dxa" w:w="110"/>
-              <w:left w:type="dxa" w:w="140"/>
-              <w:bottom w:type="dxa" w:w="110"/>
-              <w:right w:type="dxa" w:w="140"/>
-            </w:tcMar>
-          </w:tcPr>
-          <w:p>
-            <w:r>
-              <w:rPr>
-                <w:b w:val="false"/>
-                <w:bCs w:val="false"/>
-                <w:sz w:val="20"/>
-                <w:szCs w:val="20"/>
-              </w:rPr>
-              <w:t xml:space="preserve">Is there anything else I will need a login for that has not come up yet?</w:t>
-            </w:r>
-          </w:p>
-        </w:tc>
-        <w:tc>
-          <w:tcPr>
-            <w:tcW w:type="dxa" w:w="4340"/>
-            <w:shd w:fill="FFFFFF" w:val="clear"/>
             <w:tcMar>
               <w:top w:type="dxa" w:w="110"/>
               <w:left w:type="dxa" w:w="140"/>
@@ -738,7 +676,7 @@
                 <w:sz w:val="20"/>
                 <w:szCs w:val="20"/>
               </w:rPr>
-              <w:t xml:space="preserve">5</w:t>
+              <w:t xml:space="preserve">4</w:t>
             </w:r>
           </w:p>
         </w:tc>
@@ -800,7 +738,7 @@
                 <w:sz w:val="20"/>
                 <w:szCs w:val="20"/>
               </w:rPr>
-              <w:t xml:space="preserve">6</w:t>
+              <w:t xml:space="preserve">5</w:t>
             </w:r>
           </w:p>
         </w:tc>
@@ -862,7 +800,7 @@
                 <w:sz w:val="20"/>
                 <w:szCs w:val="20"/>
               </w:rPr>
-              <w:t xml:space="preserve">7</w:t>
+              <w:t xml:space="preserve">6</w:t>
             </w:r>
           </w:p>
         </w:tc>
@@ -924,7 +862,7 @@
                 <w:sz w:val="20"/>
                 <w:szCs w:val="20"/>
               </w:rPr>
-              <w:t xml:space="preserve">8</w:t>
+              <w:t xml:space="preserve">7</w:t>
             </w:r>
           </w:p>
         </w:tc>
@@ -986,7 +924,7 @@
                 <w:sz w:val="20"/>
                 <w:szCs w:val="20"/>
               </w:rPr>
-              <w:t xml:space="preserve">9</w:t>
+              <w:t xml:space="preserve">8</w:t>
             </w:r>
           </w:p>
         </w:tc>
@@ -1048,7 +986,7 @@
                 <w:sz w:val="20"/>
                 <w:szCs w:val="20"/>
               </w:rPr>
-              <w:t xml:space="preserve">10</w:t>
+              <w:t xml:space="preserve">9</w:t>
             </w:r>
           </w:p>
         </w:tc>
@@ -1079,6 +1017,68 @@
           <w:tcPr>
             <w:tcW w:type="dxa" w:w="4340"/>
             <w:shd w:fill="FFFFFF" w:val="clear"/>
+            <w:tcMar>
+              <w:top w:type="dxa" w:w="110"/>
+              <w:left w:type="dxa" w:w="140"/>
+              <w:bottom w:type="dxa" w:w="110"/>
+              <w:right w:type="dxa" w:w="140"/>
+            </w:tcMar>
+          </w:tcPr>
+          <w:p/>
+          <w:p/>
+        </w:tc>
+      </w:tr>
+      <w:tr>
+        <w:tc>
+          <w:tcPr>
+            <w:tcW w:type="dxa" w:w="620"/>
+            <w:shd w:fill="F7F9FC" w:val="clear"/>
+            <w:tcMar>
+              <w:top w:type="dxa" w:w="110"/>
+              <w:left w:type="dxa" w:w="140"/>
+              <w:bottom w:type="dxa" w:w="110"/>
+              <w:right w:type="dxa" w:w="140"/>
+            </w:tcMar>
+          </w:tcPr>
+          <w:p>
+            <w:r>
+              <w:rPr>
+                <w:b/>
+                <w:bCs/>
+                <w:sz w:val="20"/>
+                <w:szCs w:val="20"/>
+              </w:rPr>
+              <w:t xml:space="preserve">10</w:t>
+            </w:r>
+          </w:p>
+        </w:tc>
+        <w:tc>
+          <w:tcPr>
+            <w:tcW w:type="dxa" w:w="4400"/>
+            <w:shd w:fill="F7F9FC" w:val="clear"/>
+            <w:tcMar>
+              <w:top w:type="dxa" w:w="110"/>
+              <w:left w:type="dxa" w:w="140"/>
+              <w:bottom w:type="dxa" w:w="110"/>
+              <w:right w:type="dxa" w:w="140"/>
+            </w:tcMar>
+          </w:tcPr>
+          <w:p>
+            <w:r>
+              <w:rPr>
+                <w:b w:val="false"/>
+                <w:bCs w:val="false"/>
+                <w:sz w:val="20"/>
+                <w:szCs w:val="20"/>
+              </w:rPr>
+              <w:t xml:space="preserve">Employment Hero has a support and consultation process for payroll. Who is our contact there, and how do I reach them if something goes wrong mid pay run?</w:t>
+            </w:r>
+          </w:p>
+        </w:tc>
+        <w:tc>
+          <w:tcPr>
+            <w:tcW w:type="dxa" w:w="4340"/>
+            <w:shd w:fill="F7F9FC" w:val="clear"/>
             <w:tcMar>
               <w:top w:type="dxa" w:w="110"/>
               <w:left w:type="dxa" w:w="140"/>
@@ -2017,7 +2017,7 @@
                 <w:sz w:val="20"/>
                 <w:szCs w:val="20"/>
               </w:rPr>
-              <w:t xml:space="preserve">The salaried hourly rate formula divides by 1.12 to strip superannuation. What do I change when the superannuation guarantee rate changes?</w:t>
+              <w:t xml:space="preserve">Are there casual penalty rates for weekends or public holidays, and how would they show up in a pay run?</w:t>
             </w:r>
           </w:p>
         </w:tc>
@@ -2079,7 +2079,7 @@
                 <w:sz w:val="20"/>
                 <w:szCs w:val="20"/>
               </w:rPr>
-              <w:t xml:space="preserve">Are there casual penalty rates for weekends or public holidays, and how would they show up in a pay run?</w:t>
+              <w:t xml:space="preserve">The overtime matrix on file is headed 'FULL TIME STAFF'. Is there an equivalent for part-time employees, or are they treated another way?</w:t>
             </w:r>
           </w:p>
         </w:tc>
@@ -2141,7 +2141,7 @@
                 <w:sz w:val="20"/>
                 <w:szCs w:val="20"/>
               </w:rPr>
-              <w:t xml:space="preserve">The overtime matrix on file is headed 'FULL TIME STAFF'. Is there an equivalent for part-time employees, or are they treated another way?</w:t>
+              <w:t xml:space="preserve">What exactly makes work 'chargeable to the client' for the matrix's dollar columns — is that always the manager's call, or is there a rule I can apply?</w:t>
             </w:r>
           </w:p>
         </w:tc>
@@ -2149,68 +2149,6 @@
           <w:tcPr>
             <w:tcW w:type="dxa" w:w="4340"/>
             <w:shd w:fill="FFFFFF" w:val="clear"/>
-            <w:tcMar>
-              <w:top w:type="dxa" w:w="110"/>
-              <w:left w:type="dxa" w:w="140"/>
-              <w:bottom w:type="dxa" w:w="110"/>
-              <w:right w:type="dxa" w:w="140"/>
-            </w:tcMar>
-          </w:tcPr>
-          <w:p/>
-          <w:p/>
-        </w:tc>
-      </w:tr>
-      <w:tr>
-        <w:tc>
-          <w:tcPr>
-            <w:tcW w:type="dxa" w:w="620"/>
-            <w:shd w:fill="F7F9FC" w:val="clear"/>
-            <w:tcMar>
-              <w:top w:type="dxa" w:w="110"/>
-              <w:left w:type="dxa" w:w="140"/>
-              <w:bottom w:type="dxa" w:w="110"/>
-              <w:right w:type="dxa" w:w="140"/>
-            </w:tcMar>
-          </w:tcPr>
-          <w:p>
-            <w:r>
-              <w:rPr>
-                <w:b/>
-                <w:bCs/>
-                <w:sz w:val="20"/>
-                <w:szCs w:val="20"/>
-              </w:rPr>
-              <w:t xml:space="preserve">23</w:t>
-            </w:r>
-          </w:p>
-        </w:tc>
-        <w:tc>
-          <w:tcPr>
-            <w:tcW w:type="dxa" w:w="4400"/>
-            <w:shd w:fill="F7F9FC" w:val="clear"/>
-            <w:tcMar>
-              <w:top w:type="dxa" w:w="110"/>
-              <w:left w:type="dxa" w:w="140"/>
-              <w:bottom w:type="dxa" w:w="110"/>
-              <w:right w:type="dxa" w:w="140"/>
-            </w:tcMar>
-          </w:tcPr>
-          <w:p>
-            <w:r>
-              <w:rPr>
-                <w:b w:val="false"/>
-                <w:bCs w:val="false"/>
-                <w:sz w:val="20"/>
-                <w:szCs w:val="20"/>
-              </w:rPr>
-              <w:t xml:space="preserve">What exactly makes work 'chargeable to the client' for the matrix's dollar columns — is that always the manager's call, or is there a rule I can apply?</w:t>
-            </w:r>
-          </w:p>
-        </w:tc>
-        <w:tc>
-          <w:tcPr>
-            <w:tcW w:type="dxa" w:w="4340"/>
-            <w:shd w:fill="F7F9FC" w:val="clear"/>
             <w:tcMar>
               <w:top w:type="dxa" w:w="110"/>
               <w:left w:type="dxa" w:w="140"/>
@@ -2358,7 +2296,7 @@
                 <w:sz w:val="20"/>
                 <w:szCs w:val="20"/>
               </w:rPr>
-              <w:t xml:space="preserve">24</w:t>
+              <w:t xml:space="preserve">23</w:t>
             </w:r>
           </w:p>
         </w:tc>
@@ -2381,7 +2319,7 @@
                 <w:sz w:val="20"/>
                 <w:szCs w:val="20"/>
               </w:rPr>
-              <w:t xml:space="preserve">Is the populated range columns E to S or F to S? Both were said during the recordings and I want to be sure which drives the formula.</w:t>
+              <w:t xml:space="preserve">The total hours column does not handle leave without pay correctly — this was found during recording and left unresolved. Has it been fixed, and if not what is the manual workaround?</w:t>
             </w:r>
           </w:p>
         </w:tc>
@@ -2420,7 +2358,7 @@
                 <w:sz w:val="20"/>
                 <w:szCs w:val="20"/>
               </w:rPr>
-              <w:t xml:space="preserve">25</w:t>
+              <w:t xml:space="preserve">24</w:t>
             </w:r>
           </w:p>
         </w:tc>
@@ -2443,7 +2381,7 @@
                 <w:sz w:val="20"/>
                 <w:szCs w:val="20"/>
               </w:rPr>
-              <w:t xml:space="preserve">The total hours column does not handle leave without pay correctly — this was found during recording and left unresolved. Has it been fixed, and if not what is the manual workaround?</w:t>
+              <w:t xml:space="preserve">When are the Public Holiday and Jury Leave columns used, and where do those hours come from?</w:t>
             </w:r>
           </w:p>
         </w:tc>
@@ -2482,7 +2420,7 @@
                 <w:sz w:val="20"/>
                 <w:szCs w:val="20"/>
               </w:rPr>
-              <w:t xml:space="preserve">26</w:t>
+              <w:t xml:space="preserve">25</w:t>
             </w:r>
           </w:p>
         </w:tc>
@@ -2505,7 +2443,7 @@
                 <w:sz w:val="20"/>
                 <w:szCs w:val="20"/>
               </w:rPr>
-              <w:t xml:space="preserve">When are the Public Holiday and Jury Leave columns used, and where do those hours come from?</w:t>
+              <w:t xml:space="preserve">The Rate Check column shows #VALUE! against some employees. Is that expected, or does it indicate a problem?</w:t>
             </w:r>
           </w:p>
         </w:tc>
@@ -2544,7 +2482,7 @@
                 <w:sz w:val="20"/>
                 <w:szCs w:val="20"/>
               </w:rPr>
-              <w:t xml:space="preserve">27</w:t>
+              <w:t xml:space="preserve">26</w:t>
             </w:r>
           </w:p>
         </w:tc>
@@ -2567,131 +2505,7 @@
                 <w:sz w:val="20"/>
                 <w:szCs w:val="20"/>
               </w:rPr>
-              <w:t xml:space="preserve">The Rate Check column shows #VALUE! against some employees. Is that expected, or does it indicate a problem?</w:t>
-            </w:r>
-          </w:p>
-        </w:tc>
-        <w:tc>
-          <w:tcPr>
-            <w:tcW w:type="dxa" w:w="4340"/>
-            <w:shd w:fill="FFFFFF" w:val="clear"/>
-            <w:tcMar>
-              <w:top w:type="dxa" w:w="110"/>
-              <w:left w:type="dxa" w:w="140"/>
-              <w:bottom w:type="dxa" w:w="110"/>
-              <w:right w:type="dxa" w:w="140"/>
-            </w:tcMar>
-          </w:tcPr>
-          <w:p/>
-          <w:p/>
-        </w:tc>
-      </w:tr>
-      <w:tr>
-        <w:tc>
-          <w:tcPr>
-            <w:tcW w:type="dxa" w:w="620"/>
-            <w:shd w:fill="F7F9FC" w:val="clear"/>
-            <w:tcMar>
-              <w:top w:type="dxa" w:w="110"/>
-              <w:left w:type="dxa" w:w="140"/>
-              <w:bottom w:type="dxa" w:w="110"/>
-              <w:right w:type="dxa" w:w="140"/>
-            </w:tcMar>
-          </w:tcPr>
-          <w:p>
-            <w:r>
-              <w:rPr>
-                <w:b/>
-                <w:bCs/>
-                <w:sz w:val="20"/>
-                <w:szCs w:val="20"/>
-              </w:rPr>
-              <w:t xml:space="preserve">28</w:t>
-            </w:r>
-          </w:p>
-        </w:tc>
-        <w:tc>
-          <w:tcPr>
-            <w:tcW w:type="dxa" w:w="4400"/>
-            <w:shd w:fill="F7F9FC" w:val="clear"/>
-            <w:tcMar>
-              <w:top w:type="dxa" w:w="110"/>
-              <w:left w:type="dxa" w:w="140"/>
-              <w:bottom w:type="dxa" w:w="110"/>
-              <w:right w:type="dxa" w:w="140"/>
-            </w:tcMar>
-          </w:tcPr>
-          <w:p>
-            <w:r>
-              <w:rPr>
-                <w:b w:val="false"/>
-                <w:bCs w:val="false"/>
-                <w:sz w:val="20"/>
-                <w:szCs w:val="20"/>
-              </w:rPr>
               <w:t xml:space="preserve">Does green highlighting mean 'rate verified this fortnight' or 'rate was changed'? Both readings came up, and I want to use it consistently.</w:t>
-            </w:r>
-          </w:p>
-        </w:tc>
-        <w:tc>
-          <w:tcPr>
-            <w:tcW w:type="dxa" w:w="4340"/>
-            <w:shd w:fill="F7F9FC" w:val="clear"/>
-            <w:tcMar>
-              <w:top w:type="dxa" w:w="110"/>
-              <w:left w:type="dxa" w:w="140"/>
-              <w:bottom w:type="dxa" w:w="110"/>
-              <w:right w:type="dxa" w:w="140"/>
-            </w:tcMar>
-          </w:tcPr>
-          <w:p/>
-          <w:p/>
-        </w:tc>
-      </w:tr>
-      <w:tr>
-        <w:tc>
-          <w:tcPr>
-            <w:tcW w:type="dxa" w:w="620"/>
-            <w:shd w:fill="FFFFFF" w:val="clear"/>
-            <w:tcMar>
-              <w:top w:type="dxa" w:w="110"/>
-              <w:left w:type="dxa" w:w="140"/>
-              <w:bottom w:type="dxa" w:w="110"/>
-              <w:right w:type="dxa" w:w="140"/>
-            </w:tcMar>
-          </w:tcPr>
-          <w:p>
-            <w:r>
-              <w:rPr>
-                <w:b/>
-                <w:bCs/>
-                <w:sz w:val="20"/>
-                <w:szCs w:val="20"/>
-              </w:rPr>
-              <w:t xml:space="preserve">29</w:t>
-            </w:r>
-          </w:p>
-        </w:tc>
-        <w:tc>
-          <w:tcPr>
-            <w:tcW w:type="dxa" w:w="4400"/>
-            <w:shd w:fill="FFFFFF" w:val="clear"/>
-            <w:tcMar>
-              <w:top w:type="dxa" w:w="110"/>
-              <w:left w:type="dxa" w:w="140"/>
-              <w:bottom w:type="dxa" w:w="110"/>
-              <w:right w:type="dxa" w:w="140"/>
-            </w:tcMar>
-          </w:tcPr>
-          <w:p>
-            <w:r>
-              <w:rPr>
-                <w:b w:val="false"/>
-                <w:bCs w:val="false"/>
-                <w:sz w:val="20"/>
-                <w:szCs w:val="20"/>
-              </w:rPr>
-              <w:t xml:space="preserve">How far ahead is the Lookup tab populated with pay periods, and who extends it when it runs out?</w:t>
             </w:r>
           </w:p>
         </w:tc>
@@ -2900,7 +2714,7 @@
                 <w:sz w:val="20"/>
                 <w:szCs w:val="20"/>
               </w:rPr>
-              <w:t xml:space="preserve">30</w:t>
+              <w:t xml:space="preserve">27</w:t>
             </w:r>
           </w:p>
         </w:tc>
@@ -2962,7 +2776,7 @@
                 <w:sz w:val="20"/>
                 <w:szCs w:val="20"/>
               </w:rPr>
-              <w:t xml:space="preserve">31</w:t>
+              <w:t xml:space="preserve">28</w:t>
             </w:r>
           </w:p>
         </w:tc>
@@ -3024,7 +2838,7 @@
                 <w:sz w:val="20"/>
                 <w:szCs w:val="20"/>
               </w:rPr>
-              <w:t xml:space="preserve">32</w:t>
+              <w:t xml:space="preserve">29</w:t>
             </w:r>
           </w:p>
         </w:tc>
@@ -3202,7 +3016,7 @@
                 <w:sz w:val="20"/>
                 <w:szCs w:val="20"/>
               </w:rPr>
-              <w:t xml:space="preserve">33</w:t>
+              <w:t xml:space="preserve">30</w:t>
             </w:r>
           </w:p>
         </w:tc>
@@ -3264,7 +3078,7 @@
                 <w:sz w:val="20"/>
                 <w:szCs w:val="20"/>
               </w:rPr>
-              <w:t xml:space="preserve">34</w:t>
+              <w:t xml:space="preserve">31</w:t>
             </w:r>
           </w:p>
         </w:tc>
@@ -3326,7 +3140,7 @@
                 <w:sz w:val="20"/>
                 <w:szCs w:val="20"/>
               </w:rPr>
-              <w:t xml:space="preserve">35</w:t>
+              <w:t xml:space="preserve">32</w:t>
             </w:r>
           </w:p>
         </w:tc>
@@ -3388,7 +3202,7 @@
                 <w:sz w:val="20"/>
                 <w:szCs w:val="20"/>
               </w:rPr>
-              <w:t xml:space="preserve">36</w:t>
+              <w:t xml:space="preserve">33</w:t>
             </w:r>
           </w:p>
         </w:tc>
@@ -4133,7 +3947,7 @@
           <w:sz w:val="28"/>
           <w:szCs w:val="28"/>
         </w:rPr>
-        <w:t xml:space="preserve">The one thing worth more than all of these</w:t>
+        <w:t xml:space="preserve">You will be running this alone</w:t>
       </w:r>
     </w:p>
     <w:p>
@@ -4145,7 +3959,19 @@
           <w:sz w:val="22"/>
           <w:szCs w:val="22"/>
         </w:rPr>
-        <w:t xml:space="preserve">Run the next fortnight yourself, start to finish, with her sitting beside you rather than driving. Not watching her do it again — you doing it, with her available to catch mistakes.</w:t>
+        <w:t xml:space="preserve">The first pay run you do will be your own, unsupervised. She will already be on leave, so there is no practice fortnight with her beside you to fall back on.</w:t>
+      </w:r>
+    </w:p>
+    <w:p>
+      <w:pPr>
+        <w:spacing w:after="120"/>
+      </w:pPr>
+      <w:r>
+        <w:rPr>
+          <w:sz w:val="22"/>
+          <w:szCs w:val="22"/>
+        </w:rPr>
+        <w:t xml:space="preserve">That changes what this document is for. Every answer has to be captured before she goes, because there will be no chance to work it out at the desk with her there.</w:t>
       </w:r>
     </w:p>
     <w:tbl>
@@ -4184,14 +4010,14 @@
                 <w:sz w:val="22"/>
                 <w:szCs w:val="22"/>
               </w:rPr>
-              <w:t xml:space="preserve">Do this while she is still here.  </w:t>
+              <w:t xml:space="preserve">Get the answers written down.  </w:t>
             </w:r>
             <w:r>
               <w:rPr>
                 <w:sz w:val="22"/>
                 <w:szCs w:val="22"/>
               </w:rPr>
-              <w:t xml:space="preserve">Every question above assumes you will hit the problem alone and need the answer in advance. A supervised dry run surfaces the things nobody thought to ask about, including the ones she does out of habit and would never think to mention. If you only get one more session with her, make it this rather than another demonstration.</w:t>
+              <w:t xml:space="preserve">An answer given verbally in a corridor will not survive three weeks and a stressful pay day. Fill this document in as she answers, and hand it back so the answers go into the manuals themselves rather than staying in your notes.</w:t>
             </w:r>
           </w:p>
         </w:tc>
@@ -4211,7 +4037,136 @@
           <w:sz w:val="22"/>
           <w:szCs w:val="22"/>
         </w:rPr>
-        <w:t xml:space="preserve">Take this document into that session and fill in the answers as they come up naturally. Anything still blank at the end is what to ask directly.</w:t>
+        <w:t xml:space="preserve">Three of the questions matter more than the rest, because they are the ones you will need at the worst possible moment and will not be able to work out for yourself:</w:t>
+      </w:r>
+    </w:p>
+    <w:p>
+      <w:pPr>
+        <w:pStyle w:val="ListParagraph"/>
+        <w:numPr>
+          <w:ilvl w:val="0"/>
+          <w:numId w:val="2"/>
+        </w:numPr>
+        <w:spacing w:after="80"/>
+      </w:pPr>
+      <w:r>
+        <w:rPr>
+          <w:sz w:val="22"/>
+          <w:szCs w:val="22"/>
+        </w:rPr>
+        <w:t xml:space="preserve">Who approves the pay run and the payment if Graham or Duncan is unavailable</w:t>
+      </w:r>
+    </w:p>
+    <w:p>
+      <w:pPr>
+        <w:pStyle w:val="ListParagraph"/>
+        <w:numPr>
+          <w:ilvl w:val="0"/>
+          <w:numId w:val="2"/>
+        </w:numPr>
+        <w:spacing w:after="80"/>
+      </w:pPr>
+      <w:r>
+        <w:rPr>
+          <w:sz w:val="22"/>
+          <w:szCs w:val="22"/>
+        </w:rPr>
+        <w:t xml:space="preserve">Who to contact at Employment Hero when something breaks mid pay run</w:t>
+      </w:r>
+    </w:p>
+    <w:p>
+      <w:pPr>
+        <w:pStyle w:val="ListParagraph"/>
+        <w:numPr>
+          <w:ilvl w:val="0"/>
+          <w:numId w:val="2"/>
+        </w:numPr>
+        <w:spacing w:after="80"/>
+      </w:pPr>
+      <w:r>
+        <w:rPr>
+          <w:sz w:val="22"/>
+          <w:szCs w:val="22"/>
+        </w:rPr>
+        <w:t xml:space="preserve">Who your escalation is if something goes wrong on pay day</w:t>
+      </w:r>
+    </w:p>
+    <w:tbl>
+      <w:tblPr>
+        <w:tblW w:type="auto" w:w="100"/>
+        <w:tblBorders>
+          <w:top w:val="single" w:color="D0D7E5" w:sz="2"/>
+          <w:left w:val="single" w:color="1F4E79" w:sz="18"/>
+          <w:bottom w:val="single" w:color="D0D7E5" w:sz="2"/>
+          <w:right w:val="single" w:color="D0D7E5" w:sz="2"/>
+          <w:insideH w:val="none"/>
+          <w:insideV w:val="none"/>
+        </w:tblBorders>
+      </w:tblPr>
+      <w:tblGrid>
+        <w:gridCol w:w="9360"/>
+      </w:tblGrid>
+      <w:tr>
+        <w:tc>
+          <w:tcPr>
+            <w:tcW w:type="dxa" w:w="9360"/>
+            <w:shd w:fill="F2F6FB" w:val="clear"/>
+            <w:tcMar>
+              <w:top w:type="dxa" w:w="120"/>
+              <w:left w:type="dxa" w:w="180"/>
+              <w:bottom w:type="dxa" w:w="120"/>
+              <w:right w:type="dxa" w:w="180"/>
+            </w:tcMar>
+          </w:tcPr>
+          <w:p>
+            <w:r>
+              <w:rPr>
+                <w:b/>
+                <w:bCs/>
+                <w:color w:val="1F4E79"/>
+                <w:sz w:val="22"/>
+                <w:szCs w:val="22"/>
+              </w:rPr>
+              <w:t xml:space="preserve">Have those three written down before you start.  </w:t>
+            </w:r>
+            <w:r>
+              <w:rPr>
+                <w:sz w:val="22"/>
+                <w:szCs w:val="22"/>
+              </w:rPr>
+              <w:t xml:space="preserve">Names, roles and phone numbers, somewhere you can find them under pressure rather than somewhere you have to search for. Do this before your first pay run, not during it.</w:t>
+            </w:r>
+          </w:p>
+        </w:tc>
+      </w:tr>
+    </w:tbl>
+    <w:p>
+      <w:pPr>
+        <w:spacing w:after="200"/>
+      </w:pPr>
+    </w:p>
+    <w:p>
+      <w:pPr>
+        <w:spacing w:after="120"/>
+      </w:pPr>
+      <w:r>
+        <w:rPr>
+          <w:sz w:val="22"/>
+          <w:szCs w:val="22"/>
+        </w:rPr>
+        <w:t xml:space="preserve">It is also worth asking whether she would be willing to take a call if you get badly stuck. She may well say yes. But ask rather than assume, and plan as though the answer is no — she is entitled to be uncontactable, and a process that depends on reaching someone on leave is not a process.</w:t>
+      </w:r>
+    </w:p>
+    <w:p>
+      <w:pPr>
+        <w:spacing w:after="120"/>
+      </w:pPr>
+      <w:r>
+        <w:rPr>
+          <w:sz w:val="22"/>
+          <w:szCs w:val="22"/>
+        </w:rPr>
+        <w:t xml:space="preserve">Anything still blank in this document by her last day is a gap you will be carrying into your first pay run. Better to know which ones those are than to discover them on the day.</w:t>
       </w:r>
     </w:p>
     <w:p>
@@ -4479,6 +4434,12 @@
   </w:abstractNum>
   <w:num w:numId="1">
     <w:abstractNumId w:val="1"/>
+    <w:lvlOverride w:ilvl="0">
+      <w:startOverride w:val="1"/>
+    </w:lvlOverride>
+  </w:num>
+  <w:num w:numId="2">
+    <w:abstractNumId w:val="2"/>
     <w:lvlOverride w:ilvl="0">
       <w:startOverride w:val="1"/>
     </w:lvlOverride>

</xml_diff>

<commit_message>
Record what the Public Holiday and Jury Leave columns are for
They are used only when someone is on jury duty or takes that leave type,
so they sit empty in most fortnights. Replaces the open question with the
answer, and notes that an empty column is not a missed step.

Co-Authored-By: Claude Opus 5 <noreply@anthropic.com>
Claude-Session: https://claude.ai/code/session_01NGLPCmZEnLwWWew5jbH6qG
</commit_message>
<xml_diff>
--- a/manuals/Payroll Handover - Questions and Scenarios.docx
+++ b/manuals/Payroll Handover - Questions and Scenarios.docx
@@ -2186,370 +2186,6 @@
       <w:tblPr>
         <w:tblW w:type="auto" w:w="100"/>
         <w:tblBorders>
-          <w:top w:val="single" w:color="auto" w:sz="4"/>
-          <w:left w:val="single" w:color="auto" w:sz="4"/>
-          <w:bottom w:val="single" w:color="auto" w:sz="4"/>
-          <w:right w:val="single" w:color="auto" w:sz="4"/>
-          <w:insideH w:val="single" w:color="auto" w:sz="4"/>
-          <w:insideV w:val="single" w:color="auto" w:sz="4"/>
-        </w:tblBorders>
-      </w:tblPr>
-      <w:tblGrid>
-        <w:gridCol w:w="620"/>
-        <w:gridCol w:w="4400"/>
-        <w:gridCol w:w="4340"/>
-      </w:tblGrid>
-      <w:tr>
-        <w:trPr>
-          <w:tblHeader/>
-        </w:trPr>
-        <w:tc>
-          <w:tcPr>
-            <w:tcW w:type="dxa" w:w="620"/>
-            <w:shd w:fill="1F4E79" w:val="clear"/>
-            <w:tcMar>
-              <w:top w:type="dxa" w:w="110"/>
-              <w:left w:type="dxa" w:w="140"/>
-              <w:bottom w:type="dxa" w:w="110"/>
-              <w:right w:type="dxa" w:w="140"/>
-            </w:tcMar>
-          </w:tcPr>
-          <w:p>
-            <w:r>
-              <w:rPr>
-                <w:b/>
-                <w:bCs/>
-                <w:color w:val="FFFFFF"/>
-                <w:sz w:val="20"/>
-                <w:szCs w:val="20"/>
-              </w:rPr>
-              <w:t xml:space="preserve">#</w:t>
-            </w:r>
-          </w:p>
-        </w:tc>
-        <w:tc>
-          <w:tcPr>
-            <w:tcW w:type="dxa" w:w="4400"/>
-            <w:shd w:fill="1F4E79" w:val="clear"/>
-            <w:tcMar>
-              <w:top w:type="dxa" w:w="110"/>
-              <w:left w:type="dxa" w:w="140"/>
-              <w:bottom w:type="dxa" w:w="110"/>
-              <w:right w:type="dxa" w:w="140"/>
-            </w:tcMar>
-          </w:tcPr>
-          <w:p>
-            <w:r>
-              <w:rPr>
-                <w:b/>
-                <w:bCs/>
-                <w:color w:val="FFFFFF"/>
-                <w:sz w:val="20"/>
-                <w:szCs w:val="20"/>
-              </w:rPr>
-              <w:t xml:space="preserve">Question</w:t>
-            </w:r>
-          </w:p>
-        </w:tc>
-        <w:tc>
-          <w:tcPr>
-            <w:tcW w:type="dxa" w:w="4340"/>
-            <w:shd w:fill="1F4E79" w:val="clear"/>
-            <w:tcMar>
-              <w:top w:type="dxa" w:w="110"/>
-              <w:left w:type="dxa" w:w="140"/>
-              <w:bottom w:type="dxa" w:w="110"/>
-              <w:right w:type="dxa" w:w="140"/>
-            </w:tcMar>
-          </w:tcPr>
-          <w:p>
-            <w:r>
-              <w:rPr>
-                <w:b/>
-                <w:bCs/>
-                <w:color w:val="FFFFFF"/>
-                <w:sz w:val="20"/>
-                <w:szCs w:val="20"/>
-              </w:rPr>
-              <w:t xml:space="preserve">Answer</w:t>
-            </w:r>
-          </w:p>
-        </w:tc>
-      </w:tr>
-      <w:tr>
-        <w:tc>
-          <w:tcPr>
-            <w:tcW w:type="dxa" w:w="620"/>
-            <w:shd w:fill="F7F9FC" w:val="clear"/>
-            <w:tcMar>
-              <w:top w:type="dxa" w:w="110"/>
-              <w:left w:type="dxa" w:w="140"/>
-              <w:bottom w:type="dxa" w:w="110"/>
-              <w:right w:type="dxa" w:w="140"/>
-            </w:tcMar>
-          </w:tcPr>
-          <w:p>
-            <w:r>
-              <w:rPr>
-                <w:b/>
-                <w:bCs/>
-                <w:sz w:val="20"/>
-                <w:szCs w:val="20"/>
-              </w:rPr>
-              <w:t xml:space="preserve">23</w:t>
-            </w:r>
-          </w:p>
-        </w:tc>
-        <w:tc>
-          <w:tcPr>
-            <w:tcW w:type="dxa" w:w="4400"/>
-            <w:shd w:fill="F7F9FC" w:val="clear"/>
-            <w:tcMar>
-              <w:top w:type="dxa" w:w="110"/>
-              <w:left w:type="dxa" w:w="140"/>
-              <w:bottom w:type="dxa" w:w="110"/>
-              <w:right w:type="dxa" w:w="140"/>
-            </w:tcMar>
-          </w:tcPr>
-          <w:p>
-            <w:r>
-              <w:rPr>
-                <w:b w:val="false"/>
-                <w:bCs w:val="false"/>
-                <w:sz w:val="20"/>
-                <w:szCs w:val="20"/>
-              </w:rPr>
-              <w:t xml:space="preserve">The total hours column does not handle leave without pay correctly — this was found during recording and left unresolved. Has it been fixed, and if not what is the manual workaround?</w:t>
-            </w:r>
-          </w:p>
-        </w:tc>
-        <w:tc>
-          <w:tcPr>
-            <w:tcW w:type="dxa" w:w="4340"/>
-            <w:shd w:fill="F7F9FC" w:val="clear"/>
-            <w:tcMar>
-              <w:top w:type="dxa" w:w="110"/>
-              <w:left w:type="dxa" w:w="140"/>
-              <w:bottom w:type="dxa" w:w="110"/>
-              <w:right w:type="dxa" w:w="140"/>
-            </w:tcMar>
-          </w:tcPr>
-          <w:p/>
-          <w:p/>
-        </w:tc>
-      </w:tr>
-      <w:tr>
-        <w:tc>
-          <w:tcPr>
-            <w:tcW w:type="dxa" w:w="620"/>
-            <w:shd w:fill="FFFFFF" w:val="clear"/>
-            <w:tcMar>
-              <w:top w:type="dxa" w:w="110"/>
-              <w:left w:type="dxa" w:w="140"/>
-              <w:bottom w:type="dxa" w:w="110"/>
-              <w:right w:type="dxa" w:w="140"/>
-            </w:tcMar>
-          </w:tcPr>
-          <w:p>
-            <w:r>
-              <w:rPr>
-                <w:b/>
-                <w:bCs/>
-                <w:sz w:val="20"/>
-                <w:szCs w:val="20"/>
-              </w:rPr>
-              <w:t xml:space="preserve">24</w:t>
-            </w:r>
-          </w:p>
-        </w:tc>
-        <w:tc>
-          <w:tcPr>
-            <w:tcW w:type="dxa" w:w="4400"/>
-            <w:shd w:fill="FFFFFF" w:val="clear"/>
-            <w:tcMar>
-              <w:top w:type="dxa" w:w="110"/>
-              <w:left w:type="dxa" w:w="140"/>
-              <w:bottom w:type="dxa" w:w="110"/>
-              <w:right w:type="dxa" w:w="140"/>
-            </w:tcMar>
-          </w:tcPr>
-          <w:p>
-            <w:r>
-              <w:rPr>
-                <w:b w:val="false"/>
-                <w:bCs w:val="false"/>
-                <w:sz w:val="20"/>
-                <w:szCs w:val="20"/>
-              </w:rPr>
-              <w:t xml:space="preserve">When are the Public Holiday and Jury Leave columns used, and where do those hours come from?</w:t>
-            </w:r>
-          </w:p>
-        </w:tc>
-        <w:tc>
-          <w:tcPr>
-            <w:tcW w:type="dxa" w:w="4340"/>
-            <w:shd w:fill="FFFFFF" w:val="clear"/>
-            <w:tcMar>
-              <w:top w:type="dxa" w:w="110"/>
-              <w:left w:type="dxa" w:w="140"/>
-              <w:bottom w:type="dxa" w:w="110"/>
-              <w:right w:type="dxa" w:w="140"/>
-            </w:tcMar>
-          </w:tcPr>
-          <w:p/>
-          <w:p/>
-        </w:tc>
-      </w:tr>
-      <w:tr>
-        <w:tc>
-          <w:tcPr>
-            <w:tcW w:type="dxa" w:w="620"/>
-            <w:shd w:fill="F7F9FC" w:val="clear"/>
-            <w:tcMar>
-              <w:top w:type="dxa" w:w="110"/>
-              <w:left w:type="dxa" w:w="140"/>
-              <w:bottom w:type="dxa" w:w="110"/>
-              <w:right w:type="dxa" w:w="140"/>
-            </w:tcMar>
-          </w:tcPr>
-          <w:p>
-            <w:r>
-              <w:rPr>
-                <w:b/>
-                <w:bCs/>
-                <w:sz w:val="20"/>
-                <w:szCs w:val="20"/>
-              </w:rPr>
-              <w:t xml:space="preserve">25</w:t>
-            </w:r>
-          </w:p>
-        </w:tc>
-        <w:tc>
-          <w:tcPr>
-            <w:tcW w:type="dxa" w:w="4400"/>
-            <w:shd w:fill="F7F9FC" w:val="clear"/>
-            <w:tcMar>
-              <w:top w:type="dxa" w:w="110"/>
-              <w:left w:type="dxa" w:w="140"/>
-              <w:bottom w:type="dxa" w:w="110"/>
-              <w:right w:type="dxa" w:w="140"/>
-            </w:tcMar>
-          </w:tcPr>
-          <w:p>
-            <w:r>
-              <w:rPr>
-                <w:b w:val="false"/>
-                <w:bCs w:val="false"/>
-                <w:sz w:val="20"/>
-                <w:szCs w:val="20"/>
-              </w:rPr>
-              <w:t xml:space="preserve">The Rate Check column shows #VALUE! against some employees. Is that expected, or does it indicate a problem?</w:t>
-            </w:r>
-          </w:p>
-        </w:tc>
-        <w:tc>
-          <w:tcPr>
-            <w:tcW w:type="dxa" w:w="4340"/>
-            <w:shd w:fill="F7F9FC" w:val="clear"/>
-            <w:tcMar>
-              <w:top w:type="dxa" w:w="110"/>
-              <w:left w:type="dxa" w:w="140"/>
-              <w:bottom w:type="dxa" w:w="110"/>
-              <w:right w:type="dxa" w:w="140"/>
-            </w:tcMar>
-          </w:tcPr>
-          <w:p/>
-          <w:p/>
-        </w:tc>
-      </w:tr>
-      <w:tr>
-        <w:tc>
-          <w:tcPr>
-            <w:tcW w:type="dxa" w:w="620"/>
-            <w:shd w:fill="FFFFFF" w:val="clear"/>
-            <w:tcMar>
-              <w:top w:type="dxa" w:w="110"/>
-              <w:left w:type="dxa" w:w="140"/>
-              <w:bottom w:type="dxa" w:w="110"/>
-              <w:right w:type="dxa" w:w="140"/>
-            </w:tcMar>
-          </w:tcPr>
-          <w:p>
-            <w:r>
-              <w:rPr>
-                <w:b/>
-                <w:bCs/>
-                <w:sz w:val="20"/>
-                <w:szCs w:val="20"/>
-              </w:rPr>
-              <w:t xml:space="preserve">26</w:t>
-            </w:r>
-          </w:p>
-        </w:tc>
-        <w:tc>
-          <w:tcPr>
-            <w:tcW w:type="dxa" w:w="4400"/>
-            <w:shd w:fill="FFFFFF" w:val="clear"/>
-            <w:tcMar>
-              <w:top w:type="dxa" w:w="110"/>
-              <w:left w:type="dxa" w:w="140"/>
-              <w:bottom w:type="dxa" w:w="110"/>
-              <w:right w:type="dxa" w:w="140"/>
-            </w:tcMar>
-          </w:tcPr>
-          <w:p>
-            <w:r>
-              <w:rPr>
-                <w:b w:val="false"/>
-                <w:bCs w:val="false"/>
-                <w:sz w:val="20"/>
-                <w:szCs w:val="20"/>
-              </w:rPr>
-              <w:t xml:space="preserve">Does green highlighting mean 'rate verified this fortnight' or 'rate was changed'? Both readings came up, and I want to use it consistently.</w:t>
-            </w:r>
-          </w:p>
-        </w:tc>
-        <w:tc>
-          <w:tcPr>
-            <w:tcW w:type="dxa" w:w="4340"/>
-            <w:shd w:fill="FFFFFF" w:val="clear"/>
-            <w:tcMar>
-              <w:top w:type="dxa" w:w="110"/>
-              <w:left w:type="dxa" w:w="140"/>
-              <w:bottom w:type="dxa" w:w="110"/>
-              <w:right w:type="dxa" w:w="140"/>
-            </w:tcMar>
-          </w:tcPr>
-          <w:p/>
-          <w:p/>
-        </w:tc>
-      </w:tr>
-    </w:tbl>
-    <w:p>
-      <w:pPr>
-        <w:spacing w:after="200"/>
-      </w:pPr>
-    </w:p>
-    <w:p>
-      <w:pPr>
-        <w:pStyle w:val="Heading2"/>
-        <w:spacing w:after="160" w:before="360"/>
-      </w:pPr>
-      <w:r>
-        <w:rPr>
-          <w:b/>
-          <w:bCs/>
-          <w:color w:val="1F4E79"/>
-          <w:sz w:val="24"/>
-          <w:szCs w:val="24"/>
-        </w:rPr>
-        <w:t xml:space="preserve">Calendar and timing</w:t>
-      </w:r>
-    </w:p>
-    <w:tbl>
-      <w:tblPr>
-        <w:tblW w:type="auto" w:w="100"/>
-        <w:tblBorders>
           <w:top w:val="single" w:color="D0D7E5" w:sz="2"/>
           <w:left w:val="single" w:color="1F4E79" w:sz="18"/>
           <w:bottom w:val="single" w:color="D0D7E5" w:sz="2"/>
@@ -2582,14 +2218,14 @@
                 <w:sz w:val="22"/>
                 <w:szCs w:val="22"/>
               </w:rPr>
-              <w:t xml:space="preserve">The timesheet cut-off is 10am Monday.  </w:t>
+              <w:t xml:space="preserve">Public Holiday and Jury Leave columns.  </w:t>
             </w:r>
             <w:r>
               <w:rPr>
                 <w:sz w:val="22"/>
                 <w:szCs w:val="22"/>
               </w:rPr>
-              <w:t xml:space="preserve">Staff must have timesheets in by 10am on the Monday of the processing week.</w:t>
+              <w:t xml:space="preserve">These are used only when someone is actually on jury duty or takes the leave type the column covers. They sit unused in most fortnights, so an empty column is not a sign that something has been missed.</w:t>
             </w:r>
           </w:p>
         </w:tc>
@@ -2714,7 +2350,7 @@
                 <w:sz w:val="20"/>
                 <w:szCs w:val="20"/>
               </w:rPr>
-              <w:t xml:space="preserve">27</w:t>
+              <w:t xml:space="preserve">23</w:t>
             </w:r>
           </w:p>
         </w:tc>
@@ -2737,7 +2373,7 @@
                 <w:sz w:val="20"/>
                 <w:szCs w:val="20"/>
               </w:rPr>
-              <w:t xml:space="preserve">What happens when the Monday of the processing week, or the Tuesday pay date, falls on a public holiday?</w:t>
+              <w:t xml:space="preserve">The total hours column does not handle leave without pay correctly — this was found during recording and left unresolved. Has it been fixed, and if not what is the manual workaround?</w:t>
             </w:r>
           </w:p>
         </w:tc>
@@ -2776,7 +2412,7 @@
                 <w:sz w:val="20"/>
                 <w:szCs w:val="20"/>
               </w:rPr>
-              <w:t xml:space="preserve">28</w:t>
+              <w:t xml:space="preserve">24</w:t>
             </w:r>
           </w:p>
         </w:tc>
@@ -2799,7 +2435,7 @@
                 <w:sz w:val="20"/>
                 <w:szCs w:val="20"/>
               </w:rPr>
-              <w:t xml:space="preserve">How do I know a given fortnight is the last pay run of the month for bonus leave accrual, particularly when a fortnight straddles month end?</w:t>
+              <w:t xml:space="preserve">The Rate Check column shows #VALUE! against some employees. Is that expected, or does it indicate a problem?</w:t>
             </w:r>
           </w:p>
         </w:tc>
@@ -2838,7 +2474,7 @@
                 <w:sz w:val="20"/>
                 <w:szCs w:val="20"/>
               </w:rPr>
-              <w:t xml:space="preserve">29</w:t>
+              <w:t xml:space="preserve">25</w:t>
             </w:r>
           </w:p>
         </w:tc>
@@ -2861,7 +2497,7 @@
                 <w:sz w:val="20"/>
                 <w:szCs w:val="20"/>
               </w:rPr>
-              <w:t xml:space="preserve">How long before pay day does the money actually need to be in the account?</w:t>
+              <w:t xml:space="preserve">Does green highlighting mean 'rate verified this fortnight' or 'rate was changed'? Both readings came up, and I want to use it consistently.</w:t>
             </w:r>
           </w:p>
         </w:tc>
@@ -2888,7 +2524,7 @@
     </w:p>
     <w:p>
       <w:pPr>
-        <w:pStyle w:val="Heading1"/>
+        <w:pStyle w:val="Heading2"/>
         <w:spacing w:after="160" w:before="360"/>
       </w:pPr>
       <w:r>
@@ -2896,11 +2532,65 @@
           <w:b/>
           <w:bCs/>
           <w:color w:val="1F4E79"/>
-          <w:sz w:val="28"/>
-          <w:szCs w:val="28"/>
-        </w:rPr>
-        <w:t xml:space="preserve">Priority 3 — Worth having</w:t>
-      </w:r>
+          <w:sz w:val="24"/>
+          <w:szCs w:val="24"/>
+        </w:rPr>
+        <w:t xml:space="preserve">Calendar and timing</w:t>
+      </w:r>
+    </w:p>
+    <w:tbl>
+      <w:tblPr>
+        <w:tblW w:type="auto" w:w="100"/>
+        <w:tblBorders>
+          <w:top w:val="single" w:color="D0D7E5" w:sz="2"/>
+          <w:left w:val="single" w:color="1F4E79" w:sz="18"/>
+          <w:bottom w:val="single" w:color="D0D7E5" w:sz="2"/>
+          <w:right w:val="single" w:color="D0D7E5" w:sz="2"/>
+          <w:insideH w:val="none"/>
+          <w:insideV w:val="none"/>
+        </w:tblBorders>
+      </w:tblPr>
+      <w:tblGrid>
+        <w:gridCol w:w="9360"/>
+      </w:tblGrid>
+      <w:tr>
+        <w:tc>
+          <w:tcPr>
+            <w:tcW w:type="dxa" w:w="9360"/>
+            <w:shd w:fill="F2F6FB" w:val="clear"/>
+            <w:tcMar>
+              <w:top w:type="dxa" w:w="120"/>
+              <w:left w:type="dxa" w:w="180"/>
+              <w:bottom w:type="dxa" w:w="120"/>
+              <w:right w:type="dxa" w:w="180"/>
+            </w:tcMar>
+          </w:tcPr>
+          <w:p>
+            <w:r>
+              <w:rPr>
+                <w:b/>
+                <w:bCs/>
+                <w:color w:val="1F4E79"/>
+                <w:sz w:val="22"/>
+                <w:szCs w:val="22"/>
+              </w:rPr>
+              <w:t xml:space="preserve">The timesheet cut-off is 10am Monday.  </w:t>
+            </w:r>
+            <w:r>
+              <w:rPr>
+                <w:sz w:val="22"/>
+                <w:szCs w:val="22"/>
+              </w:rPr>
+              <w:t xml:space="preserve">Staff must have timesheets in by 10am on the Monday of the processing week.</w:t>
+            </w:r>
+          </w:p>
+        </w:tc>
+      </w:tr>
+    </w:tbl>
+    <w:p>
+      <w:pPr>
+        <w:spacing w:after="200"/>
+      </w:pPr>
     </w:p>
     <w:tbl>
       <w:tblPr>
@@ -3016,7 +2706,7 @@
                 <w:sz w:val="20"/>
                 <w:szCs w:val="20"/>
               </w:rPr>
-              <w:t xml:space="preserve">30</w:t>
+              <w:t xml:space="preserve">26</w:t>
             </w:r>
           </w:p>
         </w:tc>
@@ -3039,7 +2729,7 @@
                 <w:sz w:val="20"/>
                 <w:szCs w:val="20"/>
               </w:rPr>
-              <w:t xml:space="preserve">Where are bonus leave letters stored, and who issues them? Accruals are blocked until a letter is signed.</w:t>
+              <w:t xml:space="preserve">What happens when the Monday of the processing week, or the Tuesday pay date, falls on a public holiday?</w:t>
             </w:r>
           </w:p>
         </w:tc>
@@ -3078,7 +2768,7 @@
                 <w:sz w:val="20"/>
                 <w:szCs w:val="20"/>
               </w:rPr>
-              <w:t xml:space="preserve">31</w:t>
+              <w:t xml:space="preserve">27</w:t>
             </w:r>
           </w:p>
         </w:tc>
@@ -3101,7 +2791,7 @@
                 <w:sz w:val="20"/>
                 <w:szCs w:val="20"/>
               </w:rPr>
-              <w:t xml:space="preserve">What is the process when an employee queries their pay after pay day?</w:t>
+              <w:t xml:space="preserve">How do I know a given fortnight is the last pay run of the month for bonus leave accrual, particularly when a fortnight straddles month end?</w:t>
             </w:r>
           </w:p>
         </w:tc>
@@ -3140,7 +2830,7 @@
                 <w:sz w:val="20"/>
                 <w:szCs w:val="20"/>
               </w:rPr>
-              <w:t xml:space="preserve">32</w:t>
+              <w:t xml:space="preserve">28</w:t>
             </w:r>
           </w:p>
         </w:tc>
@@ -3163,7 +2853,185 @@
                 <w:sz w:val="20"/>
                 <w:szCs w:val="20"/>
               </w:rPr>
-              <w:t xml:space="preserve">Are there any employees with unusual arrangements I should know about before I meet them in a pay run?</w:t>
+              <w:t xml:space="preserve">How long before pay day does the money actually need to be in the account?</w:t>
+            </w:r>
+          </w:p>
+        </w:tc>
+        <w:tc>
+          <w:tcPr>
+            <w:tcW w:type="dxa" w:w="4340"/>
+            <w:shd w:fill="F7F9FC" w:val="clear"/>
+            <w:tcMar>
+              <w:top w:type="dxa" w:w="110"/>
+              <w:left w:type="dxa" w:w="140"/>
+              <w:bottom w:type="dxa" w:w="110"/>
+              <w:right w:type="dxa" w:w="140"/>
+            </w:tcMar>
+          </w:tcPr>
+          <w:p/>
+          <w:p/>
+        </w:tc>
+      </w:tr>
+    </w:tbl>
+    <w:p>
+      <w:pPr>
+        <w:spacing w:after="200"/>
+      </w:pPr>
+    </w:p>
+    <w:p>
+      <w:pPr>
+        <w:pStyle w:val="Heading1"/>
+        <w:spacing w:after="160" w:before="360"/>
+      </w:pPr>
+      <w:r>
+        <w:rPr>
+          <w:b/>
+          <w:bCs/>
+          <w:color w:val="1F4E79"/>
+          <w:sz w:val="28"/>
+          <w:szCs w:val="28"/>
+        </w:rPr>
+        <w:t xml:space="preserve">Priority 3 — Worth having</w:t>
+      </w:r>
+    </w:p>
+    <w:tbl>
+      <w:tblPr>
+        <w:tblW w:type="auto" w:w="100"/>
+        <w:tblBorders>
+          <w:top w:val="single" w:color="auto" w:sz="4"/>
+          <w:left w:val="single" w:color="auto" w:sz="4"/>
+          <w:bottom w:val="single" w:color="auto" w:sz="4"/>
+          <w:right w:val="single" w:color="auto" w:sz="4"/>
+          <w:insideH w:val="single" w:color="auto" w:sz="4"/>
+          <w:insideV w:val="single" w:color="auto" w:sz="4"/>
+        </w:tblBorders>
+      </w:tblPr>
+      <w:tblGrid>
+        <w:gridCol w:w="620"/>
+        <w:gridCol w:w="4400"/>
+        <w:gridCol w:w="4340"/>
+      </w:tblGrid>
+      <w:tr>
+        <w:trPr>
+          <w:tblHeader/>
+        </w:trPr>
+        <w:tc>
+          <w:tcPr>
+            <w:tcW w:type="dxa" w:w="620"/>
+            <w:shd w:fill="1F4E79" w:val="clear"/>
+            <w:tcMar>
+              <w:top w:type="dxa" w:w="110"/>
+              <w:left w:type="dxa" w:w="140"/>
+              <w:bottom w:type="dxa" w:w="110"/>
+              <w:right w:type="dxa" w:w="140"/>
+            </w:tcMar>
+          </w:tcPr>
+          <w:p>
+            <w:r>
+              <w:rPr>
+                <w:b/>
+                <w:bCs/>
+                <w:color w:val="FFFFFF"/>
+                <w:sz w:val="20"/>
+                <w:szCs w:val="20"/>
+              </w:rPr>
+              <w:t xml:space="preserve">#</w:t>
+            </w:r>
+          </w:p>
+        </w:tc>
+        <w:tc>
+          <w:tcPr>
+            <w:tcW w:type="dxa" w:w="4400"/>
+            <w:shd w:fill="1F4E79" w:val="clear"/>
+            <w:tcMar>
+              <w:top w:type="dxa" w:w="110"/>
+              <w:left w:type="dxa" w:w="140"/>
+              <w:bottom w:type="dxa" w:w="110"/>
+              <w:right w:type="dxa" w:w="140"/>
+            </w:tcMar>
+          </w:tcPr>
+          <w:p>
+            <w:r>
+              <w:rPr>
+                <w:b/>
+                <w:bCs/>
+                <w:color w:val="FFFFFF"/>
+                <w:sz w:val="20"/>
+                <w:szCs w:val="20"/>
+              </w:rPr>
+              <w:t xml:space="preserve">Question</w:t>
+            </w:r>
+          </w:p>
+        </w:tc>
+        <w:tc>
+          <w:tcPr>
+            <w:tcW w:type="dxa" w:w="4340"/>
+            <w:shd w:fill="1F4E79" w:val="clear"/>
+            <w:tcMar>
+              <w:top w:type="dxa" w:w="110"/>
+              <w:left w:type="dxa" w:w="140"/>
+              <w:bottom w:type="dxa" w:w="110"/>
+              <w:right w:type="dxa" w:w="140"/>
+            </w:tcMar>
+          </w:tcPr>
+          <w:p>
+            <w:r>
+              <w:rPr>
+                <w:b/>
+                <w:bCs/>
+                <w:color w:val="FFFFFF"/>
+                <w:sz w:val="20"/>
+                <w:szCs w:val="20"/>
+              </w:rPr>
+              <w:t xml:space="preserve">Answer</w:t>
+            </w:r>
+          </w:p>
+        </w:tc>
+      </w:tr>
+      <w:tr>
+        <w:tc>
+          <w:tcPr>
+            <w:tcW w:type="dxa" w:w="620"/>
+            <w:shd w:fill="F7F9FC" w:val="clear"/>
+            <w:tcMar>
+              <w:top w:type="dxa" w:w="110"/>
+              <w:left w:type="dxa" w:w="140"/>
+              <w:bottom w:type="dxa" w:w="110"/>
+              <w:right w:type="dxa" w:w="140"/>
+            </w:tcMar>
+          </w:tcPr>
+          <w:p>
+            <w:r>
+              <w:rPr>
+                <w:b/>
+                <w:bCs/>
+                <w:sz w:val="20"/>
+                <w:szCs w:val="20"/>
+              </w:rPr>
+              <w:t xml:space="preserve">29</w:t>
+            </w:r>
+          </w:p>
+        </w:tc>
+        <w:tc>
+          <w:tcPr>
+            <w:tcW w:type="dxa" w:w="4400"/>
+            <w:shd w:fill="F7F9FC" w:val="clear"/>
+            <w:tcMar>
+              <w:top w:type="dxa" w:w="110"/>
+              <w:left w:type="dxa" w:w="140"/>
+              <w:bottom w:type="dxa" w:w="110"/>
+              <w:right w:type="dxa" w:w="140"/>
+            </w:tcMar>
+          </w:tcPr>
+          <w:p>
+            <w:r>
+              <w:rPr>
+                <w:b w:val="false"/>
+                <w:bCs w:val="false"/>
+                <w:sz w:val="20"/>
+                <w:szCs w:val="20"/>
+              </w:rPr>
+              <w:t xml:space="preserve">Where are bonus leave letters stored, and who issues them? Accruals are blocked until a letter is signed.</w:t>
             </w:r>
           </w:p>
         </w:tc>
@@ -3202,7 +3070,131 @@
                 <w:sz w:val="20"/>
                 <w:szCs w:val="20"/>
               </w:rPr>
-              <w:t xml:space="preserve">33</w:t>
+              <w:t xml:space="preserve">30</w:t>
+            </w:r>
+          </w:p>
+        </w:tc>
+        <w:tc>
+          <w:tcPr>
+            <w:tcW w:type="dxa" w:w="4400"/>
+            <w:shd w:fill="FFFFFF" w:val="clear"/>
+            <w:tcMar>
+              <w:top w:type="dxa" w:w="110"/>
+              <w:left w:type="dxa" w:w="140"/>
+              <w:bottom w:type="dxa" w:w="110"/>
+              <w:right w:type="dxa" w:w="140"/>
+            </w:tcMar>
+          </w:tcPr>
+          <w:p>
+            <w:r>
+              <w:rPr>
+                <w:b w:val="false"/>
+                <w:bCs w:val="false"/>
+                <w:sz w:val="20"/>
+                <w:szCs w:val="20"/>
+              </w:rPr>
+              <w:t xml:space="preserve">What is the process when an employee queries their pay after pay day?</w:t>
+            </w:r>
+          </w:p>
+        </w:tc>
+        <w:tc>
+          <w:tcPr>
+            <w:tcW w:type="dxa" w:w="4340"/>
+            <w:shd w:fill="FFFFFF" w:val="clear"/>
+            <w:tcMar>
+              <w:top w:type="dxa" w:w="110"/>
+              <w:left w:type="dxa" w:w="140"/>
+              <w:bottom w:type="dxa" w:w="110"/>
+              <w:right w:type="dxa" w:w="140"/>
+            </w:tcMar>
+          </w:tcPr>
+          <w:p/>
+          <w:p/>
+        </w:tc>
+      </w:tr>
+      <w:tr>
+        <w:tc>
+          <w:tcPr>
+            <w:tcW w:type="dxa" w:w="620"/>
+            <w:shd w:fill="F7F9FC" w:val="clear"/>
+            <w:tcMar>
+              <w:top w:type="dxa" w:w="110"/>
+              <w:left w:type="dxa" w:w="140"/>
+              <w:bottom w:type="dxa" w:w="110"/>
+              <w:right w:type="dxa" w:w="140"/>
+            </w:tcMar>
+          </w:tcPr>
+          <w:p>
+            <w:r>
+              <w:rPr>
+                <w:b/>
+                <w:bCs/>
+                <w:sz w:val="20"/>
+                <w:szCs w:val="20"/>
+              </w:rPr>
+              <w:t xml:space="preserve">31</w:t>
+            </w:r>
+          </w:p>
+        </w:tc>
+        <w:tc>
+          <w:tcPr>
+            <w:tcW w:type="dxa" w:w="4400"/>
+            <w:shd w:fill="F7F9FC" w:val="clear"/>
+            <w:tcMar>
+              <w:top w:type="dxa" w:w="110"/>
+              <w:left w:type="dxa" w:w="140"/>
+              <w:bottom w:type="dxa" w:w="110"/>
+              <w:right w:type="dxa" w:w="140"/>
+            </w:tcMar>
+          </w:tcPr>
+          <w:p>
+            <w:r>
+              <w:rPr>
+                <w:b w:val="false"/>
+                <w:bCs w:val="false"/>
+                <w:sz w:val="20"/>
+                <w:szCs w:val="20"/>
+              </w:rPr>
+              <w:t xml:space="preserve">Are there any employees with unusual arrangements I should know about before I meet them in a pay run?</w:t>
+            </w:r>
+          </w:p>
+        </w:tc>
+        <w:tc>
+          <w:tcPr>
+            <w:tcW w:type="dxa" w:w="4340"/>
+            <w:shd w:fill="F7F9FC" w:val="clear"/>
+            <w:tcMar>
+              <w:top w:type="dxa" w:w="110"/>
+              <w:left w:type="dxa" w:w="140"/>
+              <w:bottom w:type="dxa" w:w="110"/>
+              <w:right w:type="dxa" w:w="140"/>
+            </w:tcMar>
+          </w:tcPr>
+          <w:p/>
+          <w:p/>
+        </w:tc>
+      </w:tr>
+      <w:tr>
+        <w:tc>
+          <w:tcPr>
+            <w:tcW w:type="dxa" w:w="620"/>
+            <w:shd w:fill="FFFFFF" w:val="clear"/>
+            <w:tcMar>
+              <w:top w:type="dxa" w:w="110"/>
+              <w:left w:type="dxa" w:w="140"/>
+              <w:bottom w:type="dxa" w:w="110"/>
+              <w:right w:type="dxa" w:w="140"/>
+            </w:tcMar>
+          </w:tcPr>
+          <w:p>
+            <w:r>
+              <w:rPr>
+                <w:b/>
+                <w:bCs/>
+                <w:sz w:val="20"/>
+                <w:szCs w:val="20"/>
+              </w:rPr>
+              <w:t xml:space="preserve">32</w:t>
             </w:r>
           </w:p>
         </w:tc>

</xml_diff>

<commit_message>
Drop the suggestion to call the outgoing officer while on leave
She will be on maternity leave, so contacting her is not a reasonable
fallback. The closing section now rests on the three escalation contacts
lined up in advance, which is what has to carry the first pay run anyway.

Co-Authored-By: Claude Opus 5 <noreply@anthropic.com>
Claude-Session: https://claude.ai/code/session_01NGLPCmZEnLwWWew5jbH6qG
</commit_message>
<xml_diff>
--- a/manuals/Payroll Handover - Questions and Scenarios.docx
+++ b/manuals/Payroll Handover - Questions and Scenarios.docx
@@ -4136,18 +4136,6 @@
       <w:pPr>
         <w:spacing w:after="200"/>
       </w:pPr>
-    </w:p>
-    <w:p>
-      <w:pPr>
-        <w:spacing w:after="120"/>
-      </w:pPr>
-      <w:r>
-        <w:rPr>
-          <w:sz w:val="22"/>
-          <w:szCs w:val="22"/>
-        </w:rPr>
-        <w:t xml:space="preserve">It is also worth asking whether she would be willing to take a call if you get badly stuck. She may well say yes. But ask rather than assume, and plan as though the answer is no — she is entitled to be uncontactable, and a process that depends on reaching someone on leave is not a process.</w:t>
-      </w:r>
     </w:p>
     <w:p>
       <w:pPr>

</xml_diff>